<commit_message>
29 - add final documentation files and diagrams
</commit_message>
<xml_diff>
--- a/documentation/OCRWorker.docx
+++ b/documentation/OCRWorker.docx
@@ -6,17 +6,67 @@
       <w:pPr>
         <w:pStyle w:val="Textbody"/>
         <w:rPr>
-          <w:rFonts w:asciiTheme="minorHAnsi" w:hAnsiTheme="minorHAnsi"/>
+          <w:rStyle w:val="StrongEmphasis"/>
+          <w:rFonts w:asciiTheme="minorHAnsi" w:hAnsiTheme="minorHAnsi"/>
+          <w:b w:val="0"/>
+          <w:bCs w:val="0"/>
           <w:lang w:val="en-US"/>
         </w:rPr>
       </w:pPr>
       <w:r>
         <w:rPr>
-          <w:rStyle w:val="StrongEmphasis"/>
-          <w:rFonts w:asciiTheme="minorHAnsi" w:hAnsiTheme="minorHAnsi"/>
+          <w:rFonts w:asciiTheme="minorHAnsi" w:hAnsiTheme="minorHAnsi"/>
+          <w:noProof/>
           <w:lang w:val="en-US"/>
         </w:rPr>
-        <w:t>API Layer</w:t>
+        <w:drawing>
+          <wp:inline distT="0" distB="0" distL="0" distR="0" wp14:anchorId="6F5D3F1C" wp14:editId="43217C6B">
+            <wp:extent cx="6115050" cy="3019425"/>
+            <wp:effectExtent l="0" t="0" r="0" b="9525"/>
+            <wp:docPr id="713525933" name="Picture 1" descr="A screenshot of a computer&#10;&#10;AI-generated content may be incorrect."/>
+            <wp:cNvGraphicFramePr>
+              <a:graphicFrameLocks xmlns:a="http://schemas.openxmlformats.org/drawingml/2006/main" noChangeAspect="1"/>
+            </wp:cNvGraphicFramePr>
+            <a:graphic xmlns:a="http://schemas.openxmlformats.org/drawingml/2006/main">
+              <a:graphicData uri="http://schemas.openxmlformats.org/drawingml/2006/picture">
+                <pic:pic xmlns:pic="http://schemas.openxmlformats.org/drawingml/2006/picture">
+                  <pic:nvPicPr>
+                    <pic:cNvPr id="713525933" name="Picture 1" descr="A screenshot of a computer&#10;&#10;AI-generated content may be incorrect."/>
+                    <pic:cNvPicPr>
+                      <a:picLocks noChangeAspect="1" noChangeArrowheads="1"/>
+                    </pic:cNvPicPr>
+                  </pic:nvPicPr>
+                  <pic:blipFill>
+                    <a:blip r:embed="rId7">
+                      <a:extLst>
+                        <a:ext uri="{28A0092B-C50C-407E-A947-70E740481C1C}">
+                          <a14:useLocalDpi xmlns:a14="http://schemas.microsoft.com/office/drawing/2010/main" val="0"/>
+                        </a:ext>
+                      </a:extLst>
+                    </a:blip>
+                    <a:srcRect/>
+                    <a:stretch>
+                      <a:fillRect/>
+                    </a:stretch>
+                  </pic:blipFill>
+                  <pic:spPr bwMode="auto">
+                    <a:xfrm>
+                      <a:off x="0" y="0"/>
+                      <a:ext cx="6115050" cy="3019425"/>
+                    </a:xfrm>
+                    <a:prstGeom prst="rect">
+                      <a:avLst/>
+                    </a:prstGeom>
+                    <a:noFill/>
+                    <a:ln>
+                      <a:noFill/>
+                    </a:ln>
+                  </pic:spPr>
+                </pic:pic>
+              </a:graphicData>
+            </a:graphic>
+          </wp:inline>
+        </w:drawing>
       </w:r>
     </w:p>
     <w:p>
@@ -24,39 +74,68 @@
         <w:pStyle w:val="Textbody"/>
         <w:rPr>
           <w:rFonts w:asciiTheme="minorHAnsi" w:hAnsiTheme="minorHAnsi"/>
-        </w:rPr>
-      </w:pPr>
-      <w:r>
-        <w:rPr>
-          <w:rFonts w:asciiTheme="minorHAnsi" w:hAnsiTheme="minorHAnsi"/>
-          <w:lang w:val="en-US"/>
-        </w:rPr>
-        <w:t>The API layer of the OCR Worker acts as the entry point for incoming OCR jobs.</w:t>
-      </w:r>
-      <w:r>
-        <w:rPr>
-          <w:rFonts w:asciiTheme="minorHAnsi" w:hAnsiTheme="minorHAnsi"/>
-          <w:lang w:val="en-US"/>
+          <w:b/>
+          <w:bCs/>
+          <w:lang w:val="en-AT"/>
+        </w:rPr>
+      </w:pPr>
+      <w:r>
+        <w:rPr>
+          <w:rFonts w:asciiTheme="minorHAnsi" w:hAnsiTheme="minorHAnsi"/>
+          <w:b/>
+          <w:bCs/>
+          <w:lang w:val="en-AT"/>
+        </w:rPr>
+        <w:t>OCR Worker – current design (Sprint 3)</w:t>
+      </w:r>
+    </w:p>
+    <w:p>
+      <w:pPr>
+        <w:pStyle w:val="Textbody"/>
+        <w:rPr>
+          <w:rFonts w:asciiTheme="minorHAnsi" w:hAnsiTheme="minorHAnsi"/>
+          <w:lang w:val="en-AT"/>
+        </w:rPr>
+      </w:pPr>
+      <w:r>
+        <w:rPr>
+          <w:rFonts w:asciiTheme="minorHAnsi" w:hAnsiTheme="minorHAnsi"/>
+          <w:b/>
+          <w:bCs/>
+          <w:lang w:val="en-AT"/>
+        </w:rPr>
+        <w:t>API / Integration Layer (current)</w:t>
+      </w:r>
+      <w:r>
+        <w:rPr>
+          <w:rFonts w:asciiTheme="minorHAnsi" w:hAnsiTheme="minorHAnsi"/>
+          <w:lang w:val="en-AT"/>
         </w:rPr>
         <w:br/>
-      </w:r>
-      <w:r>
-        <w:rPr>
-          <w:rFonts w:asciiTheme="minorHAnsi" w:hAnsiTheme="minorHAnsi"/>
-        </w:rPr>
-        <w:t xml:space="preserve">This </w:t>
+        <w:t xml:space="preserve">The OCR Worker is implemented as a single hosted service: </w:t>
       </w:r>
       <w:proofErr w:type="spellStart"/>
-      <w:r>
-        <w:rPr>
-          <w:rFonts w:asciiTheme="minorHAnsi" w:hAnsiTheme="minorHAnsi"/>
-        </w:rPr>
-        <w:t>layer</w:t>
+      <w:proofErr w:type="gramStart"/>
+      <w:r>
+        <w:rPr>
+          <w:rFonts w:asciiTheme="minorHAnsi" w:hAnsiTheme="minorHAnsi"/>
+          <w:lang w:val="en-AT"/>
+        </w:rPr>
+        <w:t>OcrWorkerService</w:t>
       </w:r>
       <w:proofErr w:type="spellEnd"/>
       <w:r>
         <w:rPr>
           <w:rFonts w:asciiTheme="minorHAnsi" w:hAnsiTheme="minorHAnsi"/>
+          <w:lang w:val="en-AT"/>
+        </w:rPr>
+        <w:t xml:space="preserve"> :</w:t>
+      </w:r>
+      <w:proofErr w:type="gramEnd"/>
+      <w:r>
+        <w:rPr>
+          <w:rFonts w:asciiTheme="minorHAnsi" w:hAnsiTheme="minorHAnsi"/>
+          <w:lang w:val="en-AT"/>
         </w:rPr>
         <w:t xml:space="preserve"> </w:t>
       </w:r>
@@ -64,57 +143,31 @@
       <w:r>
         <w:rPr>
           <w:rFonts w:asciiTheme="minorHAnsi" w:hAnsiTheme="minorHAnsi"/>
-        </w:rPr>
-        <w:t>communicates</w:t>
+          <w:lang w:val="en-AT"/>
+        </w:rPr>
+        <w:t>BackgroundService</w:t>
       </w:r>
       <w:proofErr w:type="spellEnd"/>
       <w:r>
         <w:rPr>
           <w:rFonts w:asciiTheme="minorHAnsi" w:hAnsiTheme="minorHAnsi"/>
+          <w:lang w:val="en-AT"/>
+        </w:rPr>
+        <w:t>.</w:t>
+      </w:r>
+      <w:r>
+        <w:rPr>
+          <w:rFonts w:asciiTheme="minorHAnsi" w:hAnsiTheme="minorHAnsi"/>
+          <w:lang w:val="en-AT"/>
         </w:rPr>
         <w:t xml:space="preserve"> </w:t>
       </w:r>
-      <w:proofErr w:type="spellStart"/>
-      <w:r>
-        <w:rPr>
-          <w:rFonts w:asciiTheme="minorHAnsi" w:hAnsiTheme="minorHAnsi"/>
-        </w:rPr>
-        <w:t>exclusively</w:t>
-      </w:r>
-      <w:proofErr w:type="spellEnd"/>
-      <w:r>
-        <w:rPr>
-          <w:rFonts w:asciiTheme="minorHAnsi" w:hAnsiTheme="minorHAnsi"/>
-        </w:rPr>
-        <w:t xml:space="preserve"> </w:t>
-      </w:r>
-      <w:proofErr w:type="spellStart"/>
-      <w:r>
-        <w:rPr>
-          <w:rFonts w:asciiTheme="minorHAnsi" w:hAnsiTheme="minorHAnsi"/>
-        </w:rPr>
-        <w:t>through</w:t>
-      </w:r>
-      <w:proofErr w:type="spellEnd"/>
-      <w:r>
-        <w:rPr>
-          <w:rFonts w:asciiTheme="minorHAnsi" w:hAnsiTheme="minorHAnsi"/>
-        </w:rPr>
-        <w:t xml:space="preserve"> </w:t>
-      </w:r>
-      <w:proofErr w:type="spellStart"/>
-      <w:r>
-        <w:rPr>
-          <w:rFonts w:asciiTheme="minorHAnsi" w:hAnsiTheme="minorHAnsi"/>
-        </w:rPr>
-        <w:t>RabbitMQ</w:t>
-      </w:r>
-      <w:proofErr w:type="spellEnd"/>
-      <w:r>
-        <w:rPr>
-          <w:rFonts w:asciiTheme="minorHAnsi" w:hAnsiTheme="minorHAnsi"/>
-        </w:rPr>
-        <w:t>.</w:t>
+      <w:r>
+        <w:rPr>
+          <w:rFonts w:asciiTheme="minorHAnsi" w:hAnsiTheme="minorHAnsi"/>
+          <w:lang w:val="en-AT"/>
+        </w:rPr>
+        <w:t>It is responsible for integrating with RabbitMQ and simulating OCR processing.</w:t>
       </w:r>
     </w:p>
     <w:p>
@@ -122,54 +175,19 @@
         <w:pStyle w:val="Textbody"/>
         <w:numPr>
           <w:ilvl w:val="0"/>
-          <w:numId w:val="1"/>
+          <w:numId w:val="3"/>
         </w:numPr>
         <w:rPr>
           <w:rFonts w:asciiTheme="minorHAnsi" w:hAnsiTheme="minorHAnsi"/>
-        </w:rPr>
-      </w:pPr>
-      <w:proofErr w:type="spellStart"/>
-      <w:r>
-        <w:rPr>
-          <w:rFonts w:asciiTheme="minorHAnsi" w:hAnsiTheme="minorHAnsi"/>
-        </w:rPr>
-        <w:t>Component</w:t>
-      </w:r>
-      <w:proofErr w:type="spellEnd"/>
-      <w:r>
-        <w:rPr>
-          <w:rFonts w:asciiTheme="minorHAnsi" w:hAnsiTheme="minorHAnsi"/>
-        </w:rPr>
-        <w:t xml:space="preserve">: </w:t>
-      </w:r>
-      <w:proofErr w:type="spellStart"/>
-      <w:r>
-        <w:rPr>
-          <w:rStyle w:val="SourceText"/>
-          <w:rFonts w:asciiTheme="minorHAnsi" w:hAnsiTheme="minorHAnsi"/>
-        </w:rPr>
-        <w:t>RabbitConsumerService</w:t>
-      </w:r>
-      <w:proofErr w:type="spellEnd"/>
-      <w:r>
-        <w:rPr>
-          <w:rFonts w:asciiTheme="minorHAnsi" w:hAnsiTheme="minorHAnsi"/>
-        </w:rPr>
-        <w:t xml:space="preserve"> (</w:t>
-      </w:r>
-      <w:proofErr w:type="spellStart"/>
-      <w:r>
-        <w:rPr>
-          <w:rFonts w:asciiTheme="minorHAnsi" w:hAnsiTheme="minorHAnsi"/>
-        </w:rPr>
-        <w:t>Hosted</w:t>
-      </w:r>
-      <w:proofErr w:type="spellEnd"/>
-      <w:r>
-        <w:rPr>
-          <w:rFonts w:asciiTheme="minorHAnsi" w:hAnsiTheme="minorHAnsi"/>
-        </w:rPr>
-        <w:t xml:space="preserve"> Service)</w:t>
+          <w:lang w:val="en-AT"/>
+        </w:rPr>
+      </w:pPr>
+      <w:r>
+        <w:rPr>
+          <w:rFonts w:asciiTheme="minorHAnsi" w:hAnsiTheme="minorHAnsi"/>
+          <w:lang w:val="en-AT"/>
+        </w:rPr>
+        <w:t>Reads RabbitMQ connection settings and queue names from environment variables.</w:t>
       </w:r>
     </w:p>
     <w:p>
@@ -177,34 +195,55 @@
         <w:pStyle w:val="Textbody"/>
         <w:numPr>
           <w:ilvl w:val="0"/>
-          <w:numId w:val="1"/>
+          <w:numId w:val="3"/>
         </w:numPr>
         <w:rPr>
           <w:rFonts w:asciiTheme="minorHAnsi" w:hAnsiTheme="minorHAnsi"/>
-          <w:lang w:val="en-US"/>
-        </w:rPr>
-      </w:pPr>
-      <w:r>
-        <w:rPr>
-          <w:rFonts w:asciiTheme="minorHAnsi" w:hAnsiTheme="minorHAnsi"/>
-          <w:lang w:val="en-US"/>
-        </w:rPr>
-        <w:t>Subscribes to the RabbitMQ input queue (</w:t>
-      </w:r>
-      <w:r>
-        <w:rPr>
-          <w:rStyle w:val="SourceText"/>
-          <w:rFonts w:asciiTheme="minorHAnsi" w:hAnsiTheme="minorHAnsi"/>
-          <w:lang w:val="en-US"/>
+          <w:lang w:val="en-AT"/>
+        </w:rPr>
+      </w:pPr>
+      <w:r>
+        <w:rPr>
+          <w:rFonts w:asciiTheme="minorHAnsi" w:hAnsiTheme="minorHAnsi"/>
+          <w:lang w:val="en-AT"/>
+        </w:rPr>
+        <w:t xml:space="preserve">Connects to RabbitMQ and declares the input queue (e.g. </w:t>
+      </w:r>
+      <w:proofErr w:type="spellStart"/>
+      <w:proofErr w:type="gramStart"/>
+      <w:r>
+        <w:rPr>
+          <w:rFonts w:asciiTheme="minorHAnsi" w:hAnsiTheme="minorHAnsi"/>
+          <w:lang w:val="en-AT"/>
         </w:rPr>
         <w:t>paperless.ocr.input</w:t>
       </w:r>
-      <w:r>
-        <w:rPr>
-          <w:rFonts w:asciiTheme="minorHAnsi" w:hAnsiTheme="minorHAnsi"/>
-          <w:lang w:val="en-US"/>
-        </w:rPr>
-        <w:t>)</w:t>
+      <w:proofErr w:type="spellEnd"/>
+      <w:proofErr w:type="gramEnd"/>
+      <w:r>
+        <w:rPr>
+          <w:rFonts w:asciiTheme="minorHAnsi" w:hAnsiTheme="minorHAnsi"/>
+          <w:lang w:val="en-AT"/>
+        </w:rPr>
+        <w:t xml:space="preserve">) and result queue (e.g. </w:t>
+      </w:r>
+      <w:proofErr w:type="spellStart"/>
+      <w:proofErr w:type="gramStart"/>
+      <w:r>
+        <w:rPr>
+          <w:rFonts w:asciiTheme="minorHAnsi" w:hAnsiTheme="minorHAnsi"/>
+          <w:lang w:val="en-AT"/>
+        </w:rPr>
+        <w:t>paperless.ocr.results</w:t>
+      </w:r>
+      <w:proofErr w:type="spellEnd"/>
+      <w:proofErr w:type="gramEnd"/>
+      <w:r>
+        <w:rPr>
+          <w:rFonts w:asciiTheme="minorHAnsi" w:hAnsiTheme="minorHAnsi"/>
+          <w:lang w:val="en-AT"/>
+        </w:rPr>
+        <w:t>).</w:t>
       </w:r>
     </w:p>
     <w:p>
@@ -212,49 +251,33 @@
         <w:pStyle w:val="Textbody"/>
         <w:numPr>
           <w:ilvl w:val="0"/>
-          <w:numId w:val="1"/>
+          <w:numId w:val="3"/>
         </w:numPr>
         <w:rPr>
           <w:rFonts w:asciiTheme="minorHAnsi" w:hAnsiTheme="minorHAnsi"/>
-          <w:lang w:val="en-US"/>
-        </w:rPr>
-      </w:pPr>
-      <w:r>
-        <w:rPr>
-          <w:rFonts w:asciiTheme="minorHAnsi" w:hAnsiTheme="minorHAnsi"/>
-          <w:lang w:val="en-US"/>
-        </w:rPr>
-        <w:t>Deserializes incoming messages (</w:t>
-      </w:r>
-      <w:r>
-        <w:rPr>
-          <w:rStyle w:val="SourceText"/>
-          <w:rFonts w:asciiTheme="minorHAnsi" w:hAnsiTheme="minorHAnsi"/>
-          <w:lang w:val="en-US"/>
-        </w:rPr>
-        <w:t>MessageModel</w:t>
-      </w:r>
-      <w:r>
-        <w:rPr>
-          <w:rFonts w:asciiTheme="minorHAnsi" w:hAnsiTheme="minorHAnsi"/>
-          <w:lang w:val="en-US"/>
-        </w:rPr>
-        <w:t xml:space="preserve"> / </w:t>
-      </w:r>
-      <w:r>
-        <w:rPr>
-          <w:rStyle w:val="SourceText"/>
-          <w:rFonts w:asciiTheme="minorHAnsi" w:hAnsiTheme="minorHAnsi"/>
-          <w:lang w:val="en-US"/>
-        </w:rPr>
-        <w:t>DocumentOcrRequestedDto</w:t>
-      </w:r>
-      <w:r>
-        <w:rPr>
-          <w:rFonts w:asciiTheme="minorHAnsi" w:hAnsiTheme="minorHAnsi"/>
-          <w:lang w:val="en-US"/>
-        </w:rPr>
-        <w:t>)</w:t>
+          <w:lang w:val="en-AT"/>
+        </w:rPr>
+      </w:pPr>
+      <w:r>
+        <w:rPr>
+          <w:rFonts w:asciiTheme="minorHAnsi" w:hAnsiTheme="minorHAnsi"/>
+          <w:lang w:val="en-AT"/>
+        </w:rPr>
+        <w:t>Subscribes to the input queu</w:t>
+      </w:r>
+      <w:r>
+        <w:rPr>
+          <w:rFonts w:asciiTheme="minorHAnsi" w:hAnsiTheme="minorHAnsi"/>
+          <w:lang w:val="en-AT"/>
+        </w:rPr>
+        <w:t>e</w:t>
+      </w:r>
+      <w:r>
+        <w:rPr>
+          <w:rFonts w:asciiTheme="minorHAnsi" w:hAnsiTheme="minorHAnsi"/>
+          <w:lang w:val="en-AT"/>
+        </w:rPr>
+        <w:t>.</w:t>
       </w:r>
     </w:p>
     <w:p>
@@ -262,19 +285,51 @@
         <w:pStyle w:val="Textbody"/>
         <w:numPr>
           <w:ilvl w:val="0"/>
-          <w:numId w:val="1"/>
+          <w:numId w:val="3"/>
         </w:numPr>
         <w:rPr>
           <w:rFonts w:asciiTheme="minorHAnsi" w:hAnsiTheme="minorHAnsi"/>
-          <w:lang w:val="en-US"/>
-        </w:rPr>
-      </w:pPr>
-      <w:r>
-        <w:rPr>
-          <w:rFonts w:asciiTheme="minorHAnsi" w:hAnsiTheme="minorHAnsi"/>
-          <w:lang w:val="en-US"/>
-        </w:rPr>
-        <w:t>Validates required fields (document ID, file name, storage path)</w:t>
+          <w:lang w:val="en-AT"/>
+        </w:rPr>
+      </w:pPr>
+      <w:r>
+        <w:rPr>
+          <w:rFonts w:asciiTheme="minorHAnsi" w:hAnsiTheme="minorHAnsi"/>
+          <w:lang w:val="en-AT"/>
+        </w:rPr>
+        <w:t xml:space="preserve">Deserializes incoming JSON messages to extract </w:t>
+      </w:r>
+      <w:proofErr w:type="spellStart"/>
+      <w:r>
+        <w:rPr>
+          <w:rFonts w:asciiTheme="minorHAnsi" w:hAnsiTheme="minorHAnsi"/>
+          <w:lang w:val="en-AT"/>
+        </w:rPr>
+        <w:t>DocumentId</w:t>
+      </w:r>
+      <w:proofErr w:type="spellEnd"/>
+      <w:r>
+        <w:rPr>
+          <w:rFonts w:asciiTheme="minorHAnsi" w:hAnsiTheme="minorHAnsi"/>
+          <w:lang w:val="en-AT"/>
+        </w:rPr>
+        <w:t xml:space="preserve"> and </w:t>
+      </w:r>
+      <w:proofErr w:type="spellStart"/>
+      <w:r>
+        <w:rPr>
+          <w:rFonts w:asciiTheme="minorHAnsi" w:hAnsiTheme="minorHAnsi"/>
+          <w:lang w:val="en-AT"/>
+        </w:rPr>
+        <w:t>DocumentTitle</w:t>
+      </w:r>
+      <w:proofErr w:type="spellEnd"/>
+      <w:r>
+        <w:rPr>
+          <w:rFonts w:asciiTheme="minorHAnsi" w:hAnsiTheme="minorHAnsi"/>
+          <w:lang w:val="en-AT"/>
+        </w:rPr>
+        <w:t>.</w:t>
       </w:r>
     </w:p>
     <w:p>
@@ -282,34 +337,19 @@
         <w:pStyle w:val="Textbody"/>
         <w:numPr>
           <w:ilvl w:val="0"/>
-          <w:numId w:val="1"/>
+          <w:numId w:val="3"/>
         </w:numPr>
         <w:rPr>
           <w:rFonts w:asciiTheme="minorHAnsi" w:hAnsiTheme="minorHAnsi"/>
-          <w:lang w:val="en-US"/>
-        </w:rPr>
-      </w:pPr>
-      <w:r>
-        <w:rPr>
-          <w:rFonts w:asciiTheme="minorHAnsi" w:hAnsiTheme="minorHAnsi"/>
-          <w:lang w:val="en-US"/>
-        </w:rPr>
-        <w:t>Delegates processing to the business layer (</w:t>
-      </w:r>
-      <w:r>
-        <w:rPr>
-          <w:rStyle w:val="SourceText"/>
-          <w:rFonts w:asciiTheme="minorHAnsi" w:hAnsiTheme="minorHAnsi"/>
-          <w:lang w:val="en-US"/>
-        </w:rPr>
-        <w:t>OcrProcessingService</w:t>
-      </w:r>
-      <w:r>
-        <w:rPr>
-          <w:rFonts w:asciiTheme="minorHAnsi" w:hAnsiTheme="minorHAnsi"/>
-          <w:lang w:val="en-US"/>
-        </w:rPr>
-        <w:t>)</w:t>
+          <w:lang w:val="en-AT"/>
+        </w:rPr>
+      </w:pPr>
+      <w:r>
+        <w:rPr>
+          <w:rFonts w:asciiTheme="minorHAnsi" w:hAnsiTheme="minorHAnsi"/>
+          <w:lang w:val="en-AT"/>
+        </w:rPr>
+        <w:t>Generates a fake OCR summary string for the document.</w:t>
       </w:r>
     </w:p>
     <w:p>
@@ -317,100 +357,19 @@
         <w:pStyle w:val="Textbody"/>
         <w:numPr>
           <w:ilvl w:val="0"/>
-          <w:numId w:val="1"/>
+          <w:numId w:val="3"/>
         </w:numPr>
         <w:rPr>
           <w:rFonts w:asciiTheme="minorHAnsi" w:hAnsiTheme="minorHAnsi"/>
-          <w:lang w:val="en-US"/>
-        </w:rPr>
-      </w:pPr>
-      <w:r>
-        <w:rPr>
-          <w:rFonts w:asciiTheme="minorHAnsi" w:hAnsiTheme="minorHAnsi"/>
-          <w:lang w:val="en-US"/>
-        </w:rPr>
-        <w:t>Optionally publishes result messages to the output queue (</w:t>
-      </w:r>
-      <w:r>
-        <w:rPr>
-          <w:rStyle w:val="SourceText"/>
-          <w:rFonts w:asciiTheme="minorHAnsi" w:hAnsiTheme="minorHAnsi"/>
-          <w:lang w:val="en-US"/>
-        </w:rPr>
-        <w:t>paperless.ocr.results</w:t>
-      </w:r>
-      <w:r>
-        <w:rPr>
-          <w:rFonts w:asciiTheme="minorHAnsi" w:hAnsiTheme="minorHAnsi"/>
-          <w:lang w:val="en-US"/>
-        </w:rPr>
-        <w:t>)</w:t>
-      </w:r>
-      <w:r>
-        <w:rPr>
-          <w:rFonts w:asciiTheme="minorHAnsi" w:hAnsiTheme="minorHAnsi"/>
-          <w:lang w:val="en-US"/>
-        </w:rPr>
-        <w:br/>
-        <w:t>or triggers a REST callback to the main Paperless API for persistence</w:t>
-      </w:r>
-    </w:p>
-    <w:p>
-      <w:pPr>
-        <w:pStyle w:val="Textbody"/>
-        <w:rPr>
-          <w:rFonts w:asciiTheme="minorHAnsi" w:hAnsiTheme="minorHAnsi"/>
-          <w:lang w:val="en-US"/>
-        </w:rPr>
-      </w:pPr>
-      <w:r>
-        <w:rPr>
-          <w:rFonts w:asciiTheme="minorHAnsi" w:hAnsiTheme="minorHAnsi"/>
-          <w:lang w:val="en-US"/>
-        </w:rPr>
-        <w:t>This layer encapsulates all messaging infrastructure and isolates business logic from RabbitMQ-specific code.</w:t>
-      </w:r>
-    </w:p>
-    <w:p>
-      <w:pPr>
-        <w:pStyle w:val="Textbody"/>
-        <w:rPr>
-          <w:rFonts w:asciiTheme="minorHAnsi" w:hAnsiTheme="minorHAnsi"/>
-          <w:lang w:val="en-US"/>
-        </w:rPr>
-      </w:pPr>
-    </w:p>
-    <w:p>
-      <w:pPr>
-        <w:pStyle w:val="Textbody"/>
-        <w:rPr>
-          <w:rFonts w:asciiTheme="minorHAnsi" w:hAnsiTheme="minorHAnsi"/>
-          <w:lang w:val="en-US"/>
-        </w:rPr>
-      </w:pPr>
-      <w:r>
-        <w:rPr>
-          <w:rStyle w:val="StrongEmphasis"/>
-          <w:rFonts w:asciiTheme="minorHAnsi" w:hAnsiTheme="minorHAnsi"/>
-          <w:lang w:val="en-US"/>
-        </w:rPr>
-        <w:t>Business Layer (not yet implemented)</w:t>
-      </w:r>
-    </w:p>
-    <w:p>
-      <w:pPr>
-        <w:pStyle w:val="Textbody"/>
-        <w:rPr>
-          <w:rFonts w:asciiTheme="minorHAnsi" w:hAnsiTheme="minorHAnsi"/>
-          <w:lang w:val="en-US"/>
-        </w:rPr>
-      </w:pPr>
-      <w:r>
-        <w:rPr>
-          <w:rFonts w:asciiTheme="minorHAnsi" w:hAnsiTheme="minorHAnsi"/>
-          <w:lang w:val="en-US"/>
-        </w:rPr>
-        <w:t>The business layer contains the domain logic for OCR.</w:t>
+          <w:lang w:val="en-AT"/>
+        </w:rPr>
+      </w:pPr>
+      <w:r>
+        <w:rPr>
+          <w:rFonts w:asciiTheme="minorHAnsi" w:hAnsiTheme="minorHAnsi"/>
+          <w:lang w:val="en-AT"/>
+        </w:rPr>
+        <w:t>Publishes the result as a JSON message to the result queue.</w:t>
       </w:r>
     </w:p>
     <w:p>
@@ -418,240 +377,339 @@
         <w:pStyle w:val="Textbody"/>
         <w:numPr>
           <w:ilvl w:val="0"/>
-          <w:numId w:val="2"/>
+          <w:numId w:val="3"/>
         </w:numPr>
         <w:rPr>
           <w:rFonts w:asciiTheme="minorHAnsi" w:hAnsiTheme="minorHAnsi"/>
-        </w:rPr>
-      </w:pPr>
+          <w:lang w:val="en-AT"/>
+        </w:rPr>
+      </w:pPr>
+      <w:r>
+        <w:rPr>
+          <w:rFonts w:asciiTheme="minorHAnsi" w:hAnsiTheme="minorHAnsi"/>
+          <w:lang w:val="en-AT"/>
+        </w:rPr>
+        <w:t>Uses log4net for logging and ACK/NACK semantics for reliable processing.</w:t>
+      </w:r>
+    </w:p>
+    <w:p>
+      <w:pPr>
+        <w:pStyle w:val="Textbody"/>
+        <w:rPr>
+          <w:rFonts w:asciiTheme="minorHAnsi" w:hAnsiTheme="minorHAnsi"/>
+          <w:lang w:val="en-AT"/>
+        </w:rPr>
+      </w:pPr>
+      <w:r>
+        <w:rPr>
+          <w:rFonts w:asciiTheme="minorHAnsi" w:hAnsiTheme="minorHAnsi"/>
+          <w:lang w:val="en-AT"/>
+        </w:rPr>
+        <w:t xml:space="preserve">At this stage, all logic (message handling and “OCR simulation”) is implemented inside </w:t>
+      </w:r>
       <w:proofErr w:type="spellStart"/>
       <w:r>
         <w:rPr>
           <w:rFonts w:asciiTheme="minorHAnsi" w:hAnsiTheme="minorHAnsi"/>
-        </w:rPr>
-        <w:t>Component</w:t>
+          <w:lang w:val="en-AT"/>
+        </w:rPr>
+        <w:t>OcrWorkerService</w:t>
       </w:r>
       <w:proofErr w:type="spellEnd"/>
       <w:r>
         <w:rPr>
           <w:rFonts w:asciiTheme="minorHAnsi" w:hAnsiTheme="minorHAnsi"/>
-        </w:rPr>
-        <w:t xml:space="preserve">: </w:t>
-      </w:r>
-      <w:proofErr w:type="spellStart"/>
-      <w:r>
-        <w:rPr>
-          <w:rStyle w:val="SourceText"/>
-          <w:rFonts w:asciiTheme="minorHAnsi" w:hAnsiTheme="minorHAnsi"/>
-        </w:rPr>
-        <w:t>OcrProcessingService</w:t>
-      </w:r>
-      <w:proofErr w:type="spellEnd"/>
+          <w:lang w:val="en-AT"/>
+        </w:rPr>
+        <w:t>; there is no separate business service class yet.</w:t>
+      </w:r>
+    </w:p>
+    <w:p>
+      <w:pPr>
+        <w:pStyle w:val="Textbody"/>
+        <w:rPr>
+          <w:rFonts w:asciiTheme="minorHAnsi" w:hAnsiTheme="minorHAnsi"/>
+          <w:lang w:val="en-AT"/>
+        </w:rPr>
+      </w:pPr>
+      <w:r>
+        <w:rPr>
+          <w:rFonts w:asciiTheme="minorHAnsi" w:hAnsiTheme="minorHAnsi"/>
+          <w:b/>
+          <w:bCs/>
+          <w:lang w:val="en-AT"/>
+        </w:rPr>
+        <w:t>OCR Worker – planned business layer (future sprints)</w:t>
+      </w:r>
+    </w:p>
+    <w:p>
+      <w:pPr>
+        <w:pStyle w:val="Textbody"/>
+        <w:rPr>
+          <w:rFonts w:asciiTheme="minorHAnsi" w:hAnsiTheme="minorHAnsi"/>
+          <w:lang w:val="en-AT"/>
+        </w:rPr>
+      </w:pPr>
+      <w:r>
+        <w:rPr>
+          <w:rFonts w:asciiTheme="minorHAnsi" w:hAnsiTheme="minorHAnsi"/>
+          <w:lang w:val="en-AT"/>
+        </w:rPr>
+        <w:t>Business Layer (planned, not yet implemented)</w:t>
+      </w:r>
+      <w:r>
+        <w:rPr>
+          <w:rFonts w:asciiTheme="minorHAnsi" w:hAnsiTheme="minorHAnsi"/>
+          <w:lang w:val="en-AT"/>
+        </w:rPr>
+        <w:br/>
+        <w:t>In later sprints, the OCR Worker will be refactored to separate infrastructure from OCR domain logic:</w:t>
+      </w:r>
     </w:p>
     <w:p>
       <w:pPr>
         <w:pStyle w:val="Textbody"/>
         <w:numPr>
           <w:ilvl w:val="0"/>
-          <w:numId w:val="2"/>
+          <w:numId w:val="4"/>
         </w:numPr>
         <w:rPr>
           <w:rFonts w:asciiTheme="minorHAnsi" w:hAnsiTheme="minorHAnsi"/>
-          <w:lang w:val="en-US"/>
-        </w:rPr>
-      </w:pPr>
-      <w:r>
-        <w:rPr>
-          <w:rFonts w:asciiTheme="minorHAnsi" w:hAnsiTheme="minorHAnsi"/>
-          <w:lang w:val="en-US"/>
-        </w:rPr>
-        <w:t xml:space="preserve">Retrieves the document file from MinIO via </w:t>
-      </w:r>
-      <w:r>
-        <w:rPr>
-          <w:rStyle w:val="SourceText"/>
-          <w:rFonts w:asciiTheme="minorHAnsi" w:hAnsiTheme="minorHAnsi"/>
-          <w:lang w:val="en-US"/>
-        </w:rPr>
-        <w:t>IFileStoreClient</w:t>
+          <w:lang w:val="en-AT"/>
+        </w:rPr>
+      </w:pPr>
+      <w:r>
+        <w:rPr>
+          <w:rFonts w:asciiTheme="minorHAnsi" w:hAnsiTheme="minorHAnsi"/>
+          <w:lang w:val="en-AT"/>
+        </w:rPr>
+        <w:t xml:space="preserve">A dedicated </w:t>
+      </w:r>
+      <w:proofErr w:type="spellStart"/>
+      <w:r>
+        <w:rPr>
+          <w:rFonts w:asciiTheme="minorHAnsi" w:hAnsiTheme="minorHAnsi"/>
+          <w:lang w:val="en-AT"/>
+        </w:rPr>
+        <w:t>OcrProcessingService</w:t>
+      </w:r>
+      <w:proofErr w:type="spellEnd"/>
+      <w:r>
+        <w:rPr>
+          <w:rFonts w:asciiTheme="minorHAnsi" w:hAnsiTheme="minorHAnsi"/>
+          <w:lang w:val="en-AT"/>
+        </w:rPr>
+        <w:t xml:space="preserve"> will encapsulate:</w:t>
       </w:r>
     </w:p>
     <w:p>
       <w:pPr>
         <w:pStyle w:val="Textbody"/>
         <w:numPr>
-          <w:ilvl w:val="0"/>
-          <w:numId w:val="2"/>
+          <w:ilvl w:val="1"/>
+          <w:numId w:val="4"/>
         </w:numPr>
         <w:rPr>
           <w:rFonts w:asciiTheme="minorHAnsi" w:hAnsiTheme="minorHAnsi"/>
-          <w:lang w:val="en-US"/>
-        </w:rPr>
-      </w:pPr>
-      <w:r>
-        <w:rPr>
-          <w:rFonts w:asciiTheme="minorHAnsi" w:hAnsiTheme="minorHAnsi"/>
-          <w:lang w:val="en-US"/>
-        </w:rPr>
-        <w:t>Invokes the OCR engine (</w:t>
-      </w:r>
-      <w:r>
-        <w:rPr>
-          <w:rStyle w:val="SourceText"/>
-          <w:rFonts w:asciiTheme="minorHAnsi" w:hAnsiTheme="minorHAnsi"/>
-          <w:lang w:val="en-US"/>
-        </w:rPr>
-        <w:t>ITesseractClient</w:t>
-      </w:r>
-      <w:r>
-        <w:rPr>
-          <w:rFonts w:asciiTheme="minorHAnsi" w:hAnsiTheme="minorHAnsi"/>
-          <w:lang w:val="en-US"/>
-        </w:rPr>
-        <w:t xml:space="preserve"> / </w:t>
-      </w:r>
-      <w:r>
-        <w:rPr>
-          <w:rStyle w:val="SourceText"/>
-          <w:rFonts w:asciiTheme="minorHAnsi" w:hAnsiTheme="minorHAnsi"/>
-          <w:lang w:val="en-US"/>
-        </w:rPr>
-        <w:t>IOcrEngine</w:t>
-      </w:r>
-      <w:r>
-        <w:rPr>
-          <w:rFonts w:asciiTheme="minorHAnsi" w:hAnsiTheme="minorHAnsi"/>
-          <w:lang w:val="en-US"/>
-        </w:rPr>
-        <w:t>) to extract text content</w:t>
+          <w:lang w:val="en-AT"/>
+        </w:rPr>
+      </w:pPr>
+      <w:r>
+        <w:rPr>
+          <w:rFonts w:asciiTheme="minorHAnsi" w:hAnsiTheme="minorHAnsi"/>
+          <w:lang w:val="en-AT"/>
+        </w:rPr>
+        <w:t xml:space="preserve">Retrieving the original document from </w:t>
+      </w:r>
+      <w:proofErr w:type="spellStart"/>
+      <w:r>
+        <w:rPr>
+          <w:rFonts w:asciiTheme="minorHAnsi" w:hAnsiTheme="minorHAnsi"/>
+          <w:lang w:val="en-AT"/>
+        </w:rPr>
+        <w:t>MinIO</w:t>
+      </w:r>
+      <w:proofErr w:type="spellEnd"/>
+      <w:r>
+        <w:rPr>
+          <w:rFonts w:asciiTheme="minorHAnsi" w:hAnsiTheme="minorHAnsi"/>
+          <w:lang w:val="en-AT"/>
+        </w:rPr>
+        <w:t xml:space="preserve"> (via an </w:t>
+      </w:r>
+      <w:proofErr w:type="spellStart"/>
+      <w:r>
+        <w:rPr>
+          <w:rFonts w:asciiTheme="minorHAnsi" w:hAnsiTheme="minorHAnsi"/>
+          <w:lang w:val="en-AT"/>
+        </w:rPr>
+        <w:t>IFileStoreClient</w:t>
+      </w:r>
+      <w:proofErr w:type="spellEnd"/>
+      <w:r>
+        <w:rPr>
+          <w:rFonts w:asciiTheme="minorHAnsi" w:hAnsiTheme="minorHAnsi"/>
+          <w:lang w:val="en-AT"/>
+        </w:rPr>
+        <w:t>).</w:t>
       </w:r>
     </w:p>
     <w:p>
       <w:pPr>
         <w:pStyle w:val="Textbody"/>
         <w:numPr>
-          <w:ilvl w:val="0"/>
-          <w:numId w:val="2"/>
+          <w:ilvl w:val="1"/>
+          <w:numId w:val="4"/>
         </w:numPr>
         <w:rPr>
           <w:rFonts w:asciiTheme="minorHAnsi" w:hAnsiTheme="minorHAnsi"/>
-          <w:lang w:val="en-US"/>
-        </w:rPr>
-      </w:pPr>
-      <w:r>
-        <w:rPr>
-          <w:rFonts w:asciiTheme="minorHAnsi" w:hAnsiTheme="minorHAnsi"/>
-          <w:lang w:val="en-US"/>
-        </w:rPr>
-        <w:t>Builds the OCR result model (</w:t>
-      </w:r>
-      <w:r>
-        <w:rPr>
-          <w:rStyle w:val="SourceText"/>
-          <w:rFonts w:asciiTheme="minorHAnsi" w:hAnsiTheme="minorHAnsi"/>
-          <w:lang w:val="en-US"/>
-        </w:rPr>
-        <w:t>OcrResult</w:t>
-      </w:r>
-      <w:r>
-        <w:rPr>
-          <w:rFonts w:asciiTheme="minorHAnsi" w:hAnsiTheme="minorHAnsi"/>
-          <w:lang w:val="en-US"/>
-        </w:rPr>
-        <w:t xml:space="preserve">, </w:t>
-      </w:r>
-      <w:r>
-        <w:rPr>
-          <w:rStyle w:val="SourceText"/>
-          <w:rFonts w:asciiTheme="minorHAnsi" w:hAnsiTheme="minorHAnsi"/>
-          <w:lang w:val="en-US"/>
-        </w:rPr>
-        <w:t>ResultModel</w:t>
-      </w:r>
-      <w:r>
-        <w:rPr>
-          <w:rFonts w:asciiTheme="minorHAnsi" w:hAnsiTheme="minorHAnsi"/>
-          <w:lang w:val="en-US"/>
-        </w:rPr>
-        <w:t>) with extracted text and metadata</w:t>
+          <w:lang w:val="en-AT"/>
+        </w:rPr>
+      </w:pPr>
+      <w:r>
+        <w:rPr>
+          <w:rFonts w:asciiTheme="minorHAnsi" w:hAnsiTheme="minorHAnsi"/>
+          <w:lang w:val="en-AT"/>
+        </w:rPr>
+        <w:t>Invoking a real OCR engine</w:t>
+      </w:r>
+      <w:r>
+        <w:rPr>
+          <w:rFonts w:asciiTheme="minorHAnsi" w:hAnsiTheme="minorHAnsi"/>
+          <w:lang w:val="en-AT"/>
+        </w:rPr>
+        <w:t xml:space="preserve"> </w:t>
+      </w:r>
+      <w:r>
+        <w:rPr>
+          <w:rFonts w:asciiTheme="minorHAnsi" w:hAnsiTheme="minorHAnsi"/>
+          <w:lang w:val="en-AT"/>
+        </w:rPr>
+        <w:t>to extract text.</w:t>
       </w:r>
     </w:p>
     <w:p>
       <w:pPr>
         <w:pStyle w:val="Textbody"/>
         <w:numPr>
-          <w:ilvl w:val="0"/>
-          <w:numId w:val="2"/>
+          <w:ilvl w:val="1"/>
+          <w:numId w:val="4"/>
         </w:numPr>
         <w:rPr>
           <w:rFonts w:asciiTheme="minorHAnsi" w:hAnsiTheme="minorHAnsi"/>
-          <w:lang w:val="en-US"/>
-        </w:rPr>
-      </w:pPr>
-      <w:r>
-        <w:rPr>
-          <w:rFonts w:asciiTheme="minorHAnsi" w:hAnsiTheme="minorHAnsi"/>
-          <w:lang w:val="en-US"/>
-        </w:rPr>
-        <w:t>Publishes the result to RabbitMQ (</w:t>
-      </w:r>
-      <w:proofErr w:type="gramStart"/>
-      <w:r>
-        <w:rPr>
-          <w:rStyle w:val="SourceText"/>
-          <w:rFonts w:asciiTheme="minorHAnsi" w:hAnsiTheme="minorHAnsi"/>
-          <w:lang w:val="en-US"/>
-        </w:rPr>
-        <w:t>paperless.ocr.results</w:t>
-      </w:r>
-      <w:proofErr w:type="gramEnd"/>
-      <w:r>
-        <w:rPr>
-          <w:rFonts w:asciiTheme="minorHAnsi" w:hAnsiTheme="minorHAnsi"/>
-          <w:lang w:val="en-US"/>
-        </w:rPr>
-        <w:t>) or updates the main service through its REST API</w:t>
+          <w:lang w:val="en-AT"/>
+        </w:rPr>
+      </w:pPr>
+      <w:r>
+        <w:rPr>
+          <w:rFonts w:asciiTheme="minorHAnsi" w:hAnsiTheme="minorHAnsi"/>
+          <w:lang w:val="en-AT"/>
+        </w:rPr>
+        <w:lastRenderedPageBreak/>
+        <w:t>Building a domain model for OCR results (</w:t>
+      </w:r>
+      <w:proofErr w:type="spellStart"/>
+      <w:r>
+        <w:rPr>
+          <w:rFonts w:asciiTheme="minorHAnsi" w:hAnsiTheme="minorHAnsi"/>
+          <w:lang w:val="en-AT"/>
+        </w:rPr>
+        <w:t>OcrResult</w:t>
+      </w:r>
+      <w:proofErr w:type="spellEnd"/>
+      <w:r>
+        <w:rPr>
+          <w:rFonts w:asciiTheme="minorHAnsi" w:hAnsiTheme="minorHAnsi"/>
+          <w:lang w:val="en-AT"/>
+        </w:rPr>
+        <w:t xml:space="preserve">, </w:t>
+      </w:r>
+      <w:proofErr w:type="spellStart"/>
+      <w:r>
+        <w:rPr>
+          <w:rFonts w:asciiTheme="minorHAnsi" w:hAnsiTheme="minorHAnsi"/>
+          <w:lang w:val="en-AT"/>
+        </w:rPr>
+        <w:t>ResultModel</w:t>
+      </w:r>
+      <w:proofErr w:type="spellEnd"/>
+      <w:r>
+        <w:rPr>
+          <w:rFonts w:asciiTheme="minorHAnsi" w:hAnsiTheme="minorHAnsi"/>
+          <w:lang w:val="en-AT"/>
+        </w:rPr>
+        <w:t>).</w:t>
       </w:r>
     </w:p>
     <w:p>
       <w:pPr>
         <w:pStyle w:val="Textbody"/>
         <w:numPr>
-          <w:ilvl w:val="0"/>
-          <w:numId w:val="2"/>
+          <w:ilvl w:val="1"/>
+          <w:numId w:val="4"/>
         </w:numPr>
         <w:rPr>
           <w:rFonts w:asciiTheme="minorHAnsi" w:hAnsiTheme="minorHAnsi"/>
+          <w:lang w:val="en-AT"/>
+        </w:rPr>
+      </w:pPr>
+      <w:r>
+        <w:rPr>
+          <w:rFonts w:asciiTheme="minorHAnsi" w:hAnsiTheme="minorHAnsi"/>
+          <w:lang w:val="en-AT"/>
+        </w:rPr>
+        <w:t>Publishing the result to RabbitMQ or calling the Paperless REST API for persistence.</w:t>
+      </w:r>
+    </w:p>
+    <w:p>
+      <w:pPr>
+        <w:pStyle w:val="Textbody"/>
+        <w:rPr>
+          <w:rFonts w:asciiTheme="minorHAnsi" w:hAnsiTheme="minorHAnsi"/>
+          <w:lang w:val="en-AT"/>
+        </w:rPr>
+      </w:pPr>
+      <w:proofErr w:type="spellStart"/>
+      <w:r>
+        <w:rPr>
+          <w:rFonts w:asciiTheme="minorHAnsi" w:hAnsiTheme="minorHAnsi"/>
+          <w:lang w:val="en-AT"/>
+        </w:rPr>
+        <w:t>OcrWorkerService</w:t>
+      </w:r>
+      <w:proofErr w:type="spellEnd"/>
+      <w:r>
+        <w:rPr>
+          <w:rFonts w:asciiTheme="minorHAnsi" w:hAnsiTheme="minorHAnsi"/>
+          <w:lang w:val="en-AT"/>
+        </w:rPr>
+        <w:t xml:space="preserve"> will then focus solely on message consumption and delegation, while </w:t>
+      </w:r>
+      <w:proofErr w:type="spellStart"/>
+      <w:r>
+        <w:rPr>
+          <w:rFonts w:asciiTheme="minorHAnsi" w:hAnsiTheme="minorHAnsi"/>
+          <w:lang w:val="en-AT"/>
+        </w:rPr>
+        <w:t>OcrProcessingService</w:t>
+      </w:r>
+      <w:proofErr w:type="spellEnd"/>
+      <w:r>
+        <w:rPr>
+          <w:rFonts w:asciiTheme="minorHAnsi" w:hAnsiTheme="minorHAnsi"/>
+          <w:lang w:val="en-AT"/>
+        </w:rPr>
+        <w:t xml:space="preserve"> will implement the actual OCR workflow.</w:t>
+      </w:r>
+    </w:p>
+    <w:p>
+      <w:pPr>
+        <w:pStyle w:val="Textbody"/>
+        <w:rPr>
+          <w:rFonts w:asciiTheme="minorHAnsi" w:hAnsiTheme="minorHAnsi"/>
           <w:lang w:val="en-US"/>
         </w:rPr>
       </w:pPr>
-      <w:r>
-        <w:rPr>
-          <w:rFonts w:asciiTheme="minorHAnsi" w:hAnsiTheme="minorHAnsi"/>
-          <w:lang w:val="en-US"/>
-        </w:rPr>
-        <w:t>Handles domain errors such as “document not found” or “OCR failed”</w:t>
-      </w:r>
-    </w:p>
-    <w:p>
-      <w:pPr>
-        <w:pStyle w:val="Textbody"/>
-        <w:numPr>
-          <w:ilvl w:val="0"/>
-          <w:numId w:val="2"/>
-        </w:numPr>
-        <w:rPr>
-          <w:rFonts w:asciiTheme="minorHAnsi" w:hAnsiTheme="minorHAnsi"/>
-          <w:lang w:val="en-US"/>
-        </w:rPr>
-      </w:pPr>
-      <w:r>
-        <w:rPr>
-          <w:rFonts w:asciiTheme="minorHAnsi" w:hAnsiTheme="minorHAnsi"/>
-          <w:lang w:val="en-US"/>
-        </w:rPr>
-        <w:t>Performs logging of processing duration and status</w:t>
-      </w:r>
     </w:p>
     <w:sectPr>
       <w:pgSz w:w="11906" w:h="16838"/>
@@ -706,6 +764,304 @@
 <file path=word/numbering.xml><?xml version="1.0" encoding="utf-8"?>
 <w:numbering xmlns:wpc="http://schemas.microsoft.com/office/word/2010/wordprocessingCanvas" xmlns:cx="http://schemas.microsoft.com/office/drawing/2014/chartex" xmlns:cx1="http://schemas.microsoft.com/office/drawing/2015/9/8/chartex" xmlns:cx2="http://schemas.microsoft.com/office/drawing/2015/10/21/chartex" xmlns:cx3="http://schemas.microsoft.com/office/drawing/2016/5/9/chartex" xmlns:cx4="http://schemas.microsoft.com/office/drawing/2016/5/10/chartex" xmlns:cx5="http://schemas.microsoft.com/office/drawing/2016/5/11/chartex" xmlns:cx6="http://schemas.microsoft.com/office/drawing/2016/5/12/chartex" xmlns:cx7="http://schemas.microsoft.com/office/drawing/2016/5/13/chartex" xmlns:cx8="http://schemas.microsoft.com/office/drawing/2016/5/14/chartex" xmlns:mc="http://schemas.openxmlformats.org/markup-compatibility/2006" xmlns:aink="http://schemas.microsoft.com/office/drawing/2016/ink" xmlns:am3d="http://schemas.microsoft.com/office/drawing/2017/model3d" xmlns:o="urn:schemas-microsoft-com:office:office" xmlns:oel="http://schemas.microsoft.com/office/2019/extlst" xmlns:r="http://schemas.openxmlformats.org/officeDocument/2006/relationships" xmlns:m="http://schemas.openxmlformats.org/officeDocument/2006/math" xmlns:v="urn:schemas-microsoft-com:vml" xmlns:wp14="http://schemas.microsoft.com/office/word/2010/wordprocessingDrawing" xmlns:wp="http://schemas.openxmlformats.org/drawingml/2006/wordprocessingDrawing" xmlns:w10="urn:schemas-microsoft-com:office:word" xmlns:w="http://schemas.openxmlformats.org/wordprocessingml/2006/main" xmlns:w14="http://schemas.microsoft.com/office/word/2010/wordml" xmlns:w15="http://schemas.microsoft.com/office/word/2012/wordml" xmlns:w16cex="http://schemas.microsoft.com/office/word/2018/wordml/cex" xmlns:w16cid="http://schemas.microsoft.com/office/word/2016/wordml/cid" xmlns:w16="http://schemas.microsoft.com/office/word/2018/wordml" xmlns:w16du="http://schemas.microsoft.com/office/word/2023/wordml/word16du" xmlns:w16sdtdh="http://schemas.microsoft.com/office/word/2020/wordml/sdtdatahash" xmlns:w16sdtfl="http://schemas.microsoft.com/office/word/2024/wordml/sdtformatlock" xmlns:w16se="http://schemas.microsoft.com/office/word/2015/wordml/symex" xmlns:wpg="http://schemas.microsoft.com/office/word/2010/wordprocessingGroup" xmlns:wpi="http://schemas.microsoft.com/office/word/2010/wordprocessingInk" xmlns:wne="http://schemas.microsoft.com/office/word/2006/wordml" xmlns:wps="http://schemas.microsoft.com/office/word/2010/wordprocessingShape" mc:Ignorable="w14 w15 w16se w16cid w16 w16cex w16sdtdh w16sdtfl w16du wp14">
   <w:abstractNum w:abstractNumId="0" w15:restartNumberingAfterBreak="0">
+    <w:nsid w:val="07992D00"/>
+    <w:multiLevelType w:val="multilevel"/>
+    <w:tmpl w:val="21FE691C"/>
+    <w:lvl w:ilvl="0">
+      <w:start w:val="1"/>
+      <w:numFmt w:val="bullet"/>
+      <w:lvlText w:val=""/>
+      <w:lvlJc w:val="left"/>
+      <w:pPr>
+        <w:tabs>
+          <w:tab w:val="num" w:pos="720"/>
+        </w:tabs>
+        <w:ind w:left="720" w:hanging="360"/>
+      </w:pPr>
+      <w:rPr>
+        <w:rFonts w:ascii="Symbol" w:hAnsi="Symbol" w:hint="default"/>
+        <w:sz w:val="20"/>
+      </w:rPr>
+    </w:lvl>
+    <w:lvl w:ilvl="1" w:tentative="1">
+      <w:start w:val="1"/>
+      <w:numFmt w:val="bullet"/>
+      <w:lvlText w:val="o"/>
+      <w:lvlJc w:val="left"/>
+      <w:pPr>
+        <w:tabs>
+          <w:tab w:val="num" w:pos="1440"/>
+        </w:tabs>
+        <w:ind w:left="1440" w:hanging="360"/>
+      </w:pPr>
+      <w:rPr>
+        <w:rFonts w:ascii="Courier New" w:hAnsi="Courier New" w:hint="default"/>
+        <w:sz w:val="20"/>
+      </w:rPr>
+    </w:lvl>
+    <w:lvl w:ilvl="2" w:tentative="1">
+      <w:start w:val="1"/>
+      <w:numFmt w:val="bullet"/>
+      <w:lvlText w:val=""/>
+      <w:lvlJc w:val="left"/>
+      <w:pPr>
+        <w:tabs>
+          <w:tab w:val="num" w:pos="2160"/>
+        </w:tabs>
+        <w:ind w:left="2160" w:hanging="360"/>
+      </w:pPr>
+      <w:rPr>
+        <w:rFonts w:ascii="Wingdings" w:hAnsi="Wingdings" w:hint="default"/>
+        <w:sz w:val="20"/>
+      </w:rPr>
+    </w:lvl>
+    <w:lvl w:ilvl="3" w:tentative="1">
+      <w:start w:val="1"/>
+      <w:numFmt w:val="bullet"/>
+      <w:lvlText w:val=""/>
+      <w:lvlJc w:val="left"/>
+      <w:pPr>
+        <w:tabs>
+          <w:tab w:val="num" w:pos="2880"/>
+        </w:tabs>
+        <w:ind w:left="2880" w:hanging="360"/>
+      </w:pPr>
+      <w:rPr>
+        <w:rFonts w:ascii="Wingdings" w:hAnsi="Wingdings" w:hint="default"/>
+        <w:sz w:val="20"/>
+      </w:rPr>
+    </w:lvl>
+    <w:lvl w:ilvl="4" w:tentative="1">
+      <w:start w:val="1"/>
+      <w:numFmt w:val="bullet"/>
+      <w:lvlText w:val=""/>
+      <w:lvlJc w:val="left"/>
+      <w:pPr>
+        <w:tabs>
+          <w:tab w:val="num" w:pos="3600"/>
+        </w:tabs>
+        <w:ind w:left="3600" w:hanging="360"/>
+      </w:pPr>
+      <w:rPr>
+        <w:rFonts w:ascii="Wingdings" w:hAnsi="Wingdings" w:hint="default"/>
+        <w:sz w:val="20"/>
+      </w:rPr>
+    </w:lvl>
+    <w:lvl w:ilvl="5" w:tentative="1">
+      <w:start w:val="1"/>
+      <w:numFmt w:val="bullet"/>
+      <w:lvlText w:val=""/>
+      <w:lvlJc w:val="left"/>
+      <w:pPr>
+        <w:tabs>
+          <w:tab w:val="num" w:pos="4320"/>
+        </w:tabs>
+        <w:ind w:left="4320" w:hanging="360"/>
+      </w:pPr>
+      <w:rPr>
+        <w:rFonts w:ascii="Wingdings" w:hAnsi="Wingdings" w:hint="default"/>
+        <w:sz w:val="20"/>
+      </w:rPr>
+    </w:lvl>
+    <w:lvl w:ilvl="6" w:tentative="1">
+      <w:start w:val="1"/>
+      <w:numFmt w:val="bullet"/>
+      <w:lvlText w:val=""/>
+      <w:lvlJc w:val="left"/>
+      <w:pPr>
+        <w:tabs>
+          <w:tab w:val="num" w:pos="5040"/>
+        </w:tabs>
+        <w:ind w:left="5040" w:hanging="360"/>
+      </w:pPr>
+      <w:rPr>
+        <w:rFonts w:ascii="Wingdings" w:hAnsi="Wingdings" w:hint="default"/>
+        <w:sz w:val="20"/>
+      </w:rPr>
+    </w:lvl>
+    <w:lvl w:ilvl="7" w:tentative="1">
+      <w:start w:val="1"/>
+      <w:numFmt w:val="bullet"/>
+      <w:lvlText w:val=""/>
+      <w:lvlJc w:val="left"/>
+      <w:pPr>
+        <w:tabs>
+          <w:tab w:val="num" w:pos="5760"/>
+        </w:tabs>
+        <w:ind w:left="5760" w:hanging="360"/>
+      </w:pPr>
+      <w:rPr>
+        <w:rFonts w:ascii="Wingdings" w:hAnsi="Wingdings" w:hint="default"/>
+        <w:sz w:val="20"/>
+      </w:rPr>
+    </w:lvl>
+    <w:lvl w:ilvl="8" w:tentative="1">
+      <w:start w:val="1"/>
+      <w:numFmt w:val="bullet"/>
+      <w:lvlText w:val=""/>
+      <w:lvlJc w:val="left"/>
+      <w:pPr>
+        <w:tabs>
+          <w:tab w:val="num" w:pos="6480"/>
+        </w:tabs>
+        <w:ind w:left="6480" w:hanging="360"/>
+      </w:pPr>
+      <w:rPr>
+        <w:rFonts w:ascii="Wingdings" w:hAnsi="Wingdings" w:hint="default"/>
+        <w:sz w:val="20"/>
+      </w:rPr>
+    </w:lvl>
+  </w:abstractNum>
+  <w:abstractNum w:abstractNumId="1" w15:restartNumberingAfterBreak="0">
+    <w:nsid w:val="1CCE33D0"/>
+    <w:multiLevelType w:val="multilevel"/>
+    <w:tmpl w:val="02388436"/>
+    <w:lvl w:ilvl="0">
+      <w:start w:val="1"/>
+      <w:numFmt w:val="bullet"/>
+      <w:lvlText w:val=""/>
+      <w:lvlJc w:val="left"/>
+      <w:pPr>
+        <w:tabs>
+          <w:tab w:val="num" w:pos="720"/>
+        </w:tabs>
+        <w:ind w:left="720" w:hanging="360"/>
+      </w:pPr>
+      <w:rPr>
+        <w:rFonts w:ascii="Symbol" w:hAnsi="Symbol" w:hint="default"/>
+        <w:sz w:val="20"/>
+      </w:rPr>
+    </w:lvl>
+    <w:lvl w:ilvl="1">
+      <w:start w:val="1"/>
+      <w:numFmt w:val="bullet"/>
+      <w:lvlText w:val="o"/>
+      <w:lvlJc w:val="left"/>
+      <w:pPr>
+        <w:tabs>
+          <w:tab w:val="num" w:pos="1440"/>
+        </w:tabs>
+        <w:ind w:left="1440" w:hanging="360"/>
+      </w:pPr>
+      <w:rPr>
+        <w:rFonts w:ascii="Courier New" w:hAnsi="Courier New" w:hint="default"/>
+        <w:sz w:val="20"/>
+      </w:rPr>
+    </w:lvl>
+    <w:lvl w:ilvl="2" w:tentative="1">
+      <w:start w:val="1"/>
+      <w:numFmt w:val="bullet"/>
+      <w:lvlText w:val=""/>
+      <w:lvlJc w:val="left"/>
+      <w:pPr>
+        <w:tabs>
+          <w:tab w:val="num" w:pos="2160"/>
+        </w:tabs>
+        <w:ind w:left="2160" w:hanging="360"/>
+      </w:pPr>
+      <w:rPr>
+        <w:rFonts w:ascii="Wingdings" w:hAnsi="Wingdings" w:hint="default"/>
+        <w:sz w:val="20"/>
+      </w:rPr>
+    </w:lvl>
+    <w:lvl w:ilvl="3" w:tentative="1">
+      <w:start w:val="1"/>
+      <w:numFmt w:val="bullet"/>
+      <w:lvlText w:val=""/>
+      <w:lvlJc w:val="left"/>
+      <w:pPr>
+        <w:tabs>
+          <w:tab w:val="num" w:pos="2880"/>
+        </w:tabs>
+        <w:ind w:left="2880" w:hanging="360"/>
+      </w:pPr>
+      <w:rPr>
+        <w:rFonts w:ascii="Wingdings" w:hAnsi="Wingdings" w:hint="default"/>
+        <w:sz w:val="20"/>
+      </w:rPr>
+    </w:lvl>
+    <w:lvl w:ilvl="4" w:tentative="1">
+      <w:start w:val="1"/>
+      <w:numFmt w:val="bullet"/>
+      <w:lvlText w:val=""/>
+      <w:lvlJc w:val="left"/>
+      <w:pPr>
+        <w:tabs>
+          <w:tab w:val="num" w:pos="3600"/>
+        </w:tabs>
+        <w:ind w:left="3600" w:hanging="360"/>
+      </w:pPr>
+      <w:rPr>
+        <w:rFonts w:ascii="Wingdings" w:hAnsi="Wingdings" w:hint="default"/>
+        <w:sz w:val="20"/>
+      </w:rPr>
+    </w:lvl>
+    <w:lvl w:ilvl="5" w:tentative="1">
+      <w:start w:val="1"/>
+      <w:numFmt w:val="bullet"/>
+      <w:lvlText w:val=""/>
+      <w:lvlJc w:val="left"/>
+      <w:pPr>
+        <w:tabs>
+          <w:tab w:val="num" w:pos="4320"/>
+        </w:tabs>
+        <w:ind w:left="4320" w:hanging="360"/>
+      </w:pPr>
+      <w:rPr>
+        <w:rFonts w:ascii="Wingdings" w:hAnsi="Wingdings" w:hint="default"/>
+        <w:sz w:val="20"/>
+      </w:rPr>
+    </w:lvl>
+    <w:lvl w:ilvl="6" w:tentative="1">
+      <w:start w:val="1"/>
+      <w:numFmt w:val="bullet"/>
+      <w:lvlText w:val=""/>
+      <w:lvlJc w:val="left"/>
+      <w:pPr>
+        <w:tabs>
+          <w:tab w:val="num" w:pos="5040"/>
+        </w:tabs>
+        <w:ind w:left="5040" w:hanging="360"/>
+      </w:pPr>
+      <w:rPr>
+        <w:rFonts w:ascii="Wingdings" w:hAnsi="Wingdings" w:hint="default"/>
+        <w:sz w:val="20"/>
+      </w:rPr>
+    </w:lvl>
+    <w:lvl w:ilvl="7" w:tentative="1">
+      <w:start w:val="1"/>
+      <w:numFmt w:val="bullet"/>
+      <w:lvlText w:val=""/>
+      <w:lvlJc w:val="left"/>
+      <w:pPr>
+        <w:tabs>
+          <w:tab w:val="num" w:pos="5760"/>
+        </w:tabs>
+        <w:ind w:left="5760" w:hanging="360"/>
+      </w:pPr>
+      <w:rPr>
+        <w:rFonts w:ascii="Wingdings" w:hAnsi="Wingdings" w:hint="default"/>
+        <w:sz w:val="20"/>
+      </w:rPr>
+    </w:lvl>
+    <w:lvl w:ilvl="8" w:tentative="1">
+      <w:start w:val="1"/>
+      <w:numFmt w:val="bullet"/>
+      <w:lvlText w:val=""/>
+      <w:lvlJc w:val="left"/>
+      <w:pPr>
+        <w:tabs>
+          <w:tab w:val="num" w:pos="6480"/>
+        </w:tabs>
+        <w:ind w:left="6480" w:hanging="360"/>
+      </w:pPr>
+      <w:rPr>
+        <w:rFonts w:ascii="Wingdings" w:hAnsi="Wingdings" w:hint="default"/>
+        <w:sz w:val="20"/>
+      </w:rPr>
+    </w:lvl>
+  </w:abstractNum>
+  <w:abstractNum w:abstractNumId="2" w15:restartNumberingAfterBreak="0">
     <w:nsid w:val="67602C11"/>
     <w:multiLevelType w:val="multilevel"/>
     <w:tmpl w:val="91AC0A7E"/>
@@ -809,7 +1165,7 @@
       </w:rPr>
     </w:lvl>
   </w:abstractNum>
-  <w:abstractNum w:abstractNumId="1" w15:restartNumberingAfterBreak="0">
+  <w:abstractNum w:abstractNumId="3" w15:restartNumberingAfterBreak="0">
     <w:nsid w:val="6994215F"/>
     <w:multiLevelType w:val="multilevel"/>
     <w:tmpl w:val="FFB0D0E0"/>
@@ -914,10 +1270,16 @@
     </w:lvl>
   </w:abstractNum>
   <w:num w:numId="1" w16cid:durableId="1888298920">
-    <w:abstractNumId w:val="1"/>
+    <w:abstractNumId w:val="3"/>
   </w:num>
   <w:num w:numId="2" w16cid:durableId="7024205">
+    <w:abstractNumId w:val="2"/>
+  </w:num>
+  <w:num w:numId="3" w16cid:durableId="1716733679">
     <w:abstractNumId w:val="0"/>
+  </w:num>
+  <w:num w:numId="4" w16cid:durableId="1109273640">
+    <w:abstractNumId w:val="1"/>
   </w:num>
 </w:numbering>
 </file>
@@ -1345,7 +1707,6 @@
   <w:style w:type="character" w:default="1" w:styleId="DefaultParagraphFont">
     <w:name w:val="Default Paragraph Font"/>
     <w:uiPriority w:val="1"/>
-    <w:semiHidden/>
     <w:unhideWhenUsed/>
   </w:style>
   <w:style w:type="table" w:default="1" w:styleId="TableNormal">

</xml_diff>

<commit_message>
44 - Architecture and OCR worker documentation update
</commit_message>
<xml_diff>
--- a/documentation/OCRWorker.docx
+++ b/documentation/OCRWorker.docx
@@ -15,15 +15,13 @@
       </w:pPr>
       <w:r>
         <w:rPr>
-          <w:rFonts w:asciiTheme="minorHAnsi" w:hAnsiTheme="minorHAnsi"/>
           <w:noProof/>
-          <w:lang w:val="en-US"/>
         </w:rPr>
         <w:drawing>
-          <wp:inline distT="0" distB="0" distL="0" distR="0" wp14:anchorId="6F5D3F1C" wp14:editId="43217C6B">
-            <wp:extent cx="6115050" cy="3019425"/>
-            <wp:effectExtent l="0" t="0" r="0" b="9525"/>
-            <wp:docPr id="713525933" name="Picture 1" descr="A screenshot of a computer&#10;&#10;AI-generated content may be incorrect."/>
+          <wp:inline distT="0" distB="0" distL="0" distR="0" wp14:anchorId="55E486E0" wp14:editId="1184BB8F">
+            <wp:extent cx="6120130" cy="4088765"/>
+            <wp:effectExtent l="0" t="0" r="0" b="6985"/>
+            <wp:docPr id="1785702531" name="Picture 1" descr="PlantUML diagram"/>
             <wp:cNvGraphicFramePr>
               <a:graphicFrameLocks xmlns:a="http://schemas.openxmlformats.org/drawingml/2006/main" noChangeAspect="1"/>
             </wp:cNvGraphicFramePr>
@@ -31,7 +29,7 @@
               <a:graphicData uri="http://schemas.openxmlformats.org/drawingml/2006/picture">
                 <pic:pic xmlns:pic="http://schemas.openxmlformats.org/drawingml/2006/picture">
                   <pic:nvPicPr>
-                    <pic:cNvPr id="713525933" name="Picture 1" descr="A screenshot of a computer&#10;&#10;AI-generated content may be incorrect."/>
+                    <pic:cNvPr id="0" name="theimg" descr="PlantUML diagram"/>
                     <pic:cNvPicPr>
                       <a:picLocks noChangeAspect="1" noChangeArrowheads="1"/>
                     </pic:cNvPicPr>
@@ -52,7 +50,7 @@
                   <pic:spPr bwMode="auto">
                     <a:xfrm>
                       <a:off x="0" y="0"/>
-                      <a:ext cx="6115050" cy="3019425"/>
+                      <a:ext cx="6120130" cy="4088765"/>
                     </a:xfrm>
                     <a:prstGeom prst="rect">
                       <a:avLst/>
@@ -86,7 +84,25 @@
           <w:bCs/>
           <w:lang w:val="en-AT"/>
         </w:rPr>
-        <w:t>OCR Worker – current design (Sprint 3)</w:t>
+        <w:t>OCR Worker – current design (Sprint</w:t>
+      </w:r>
+      <w:r>
+        <w:rPr>
+          <w:rFonts w:asciiTheme="minorHAnsi" w:hAnsiTheme="minorHAnsi"/>
+          <w:b/>
+          <w:bCs/>
+          <w:lang w:val="en-AT"/>
+        </w:rPr>
+        <w:t xml:space="preserve"> 4</w:t>
+      </w:r>
+      <w:r>
+        <w:rPr>
+          <w:rFonts w:asciiTheme="minorHAnsi" w:hAnsiTheme="minorHAnsi"/>
+          <w:b/>
+          <w:bCs/>
+          <w:lang w:val="en-AT"/>
+        </w:rPr>
+        <w:t>)</w:t>
       </w:r>
     </w:p>
     <w:p>
@@ -100,18 +116,8 @@
       <w:r>
         <w:rPr>
           <w:rFonts w:asciiTheme="minorHAnsi" w:hAnsiTheme="minorHAnsi"/>
-          <w:b/>
-          <w:bCs/>
-          <w:lang w:val="en-AT"/>
-        </w:rPr>
-        <w:t>API / Integration Layer (current)</w:t>
-      </w:r>
-      <w:r>
-        <w:rPr>
-          <w:rFonts w:asciiTheme="minorHAnsi" w:hAnsiTheme="minorHAnsi"/>
-          <w:lang w:val="en-AT"/>
-        </w:rPr>
-        <w:br/>
+          <w:lang w:val="en-AT"/>
+        </w:rPr>
         <w:t xml:space="preserve">The OCR Worker is implemented as a single hosted service: </w:t>
       </w:r>
       <w:proofErr w:type="spellStart"/>
@@ -167,7 +173,23 @@
           <w:rFonts w:asciiTheme="minorHAnsi" w:hAnsiTheme="minorHAnsi"/>
           <w:lang w:val="en-AT"/>
         </w:rPr>
-        <w:t>It is responsible for integrating with RabbitMQ and simulating OCR processing.</w:t>
+        <w:t xml:space="preserve">It is responsible for integrating with RabbitMQ, retrieving documents from </w:t>
+      </w:r>
+      <w:proofErr w:type="spellStart"/>
+      <w:r>
+        <w:rPr>
+          <w:rFonts w:asciiTheme="minorHAnsi" w:hAnsiTheme="minorHAnsi"/>
+          <w:lang w:val="en-AT"/>
+        </w:rPr>
+        <w:t>MinIO</w:t>
+      </w:r>
+      <w:proofErr w:type="spellEnd"/>
+      <w:r>
+        <w:rPr>
+          <w:rFonts w:asciiTheme="minorHAnsi" w:hAnsiTheme="minorHAnsi"/>
+          <w:lang w:val="en-AT"/>
+        </w:rPr>
+        <w:t>, and performing OCR.</w:t>
       </w:r>
     </w:p>
     <w:p>
@@ -175,7 +197,7 @@
         <w:pStyle w:val="Textbody"/>
         <w:numPr>
           <w:ilvl w:val="0"/>
-          <w:numId w:val="3"/>
+          <w:numId w:val="5"/>
         </w:numPr>
         <w:rPr>
           <w:rFonts w:asciiTheme="minorHAnsi" w:hAnsiTheme="minorHAnsi"/>
@@ -187,7 +209,43 @@
           <w:rFonts w:asciiTheme="minorHAnsi" w:hAnsiTheme="minorHAnsi"/>
           <w:lang w:val="en-AT"/>
         </w:rPr>
-        <w:t>Reads RabbitMQ connection settings and queue names from environment variables.</w:t>
+        <w:t>Reads RabbitMQ connection settings and queue names (</w:t>
+      </w:r>
+      <w:proofErr w:type="spellStart"/>
+      <w:proofErr w:type="gramStart"/>
+      <w:r>
+        <w:rPr>
+          <w:rFonts w:asciiTheme="minorHAnsi" w:hAnsiTheme="minorHAnsi"/>
+          <w:lang w:val="en-AT"/>
+        </w:rPr>
+        <w:t>paperless.ocr.input</w:t>
+      </w:r>
+      <w:proofErr w:type="spellEnd"/>
+      <w:proofErr w:type="gramEnd"/>
+      <w:r>
+        <w:rPr>
+          <w:rFonts w:asciiTheme="minorHAnsi" w:hAnsiTheme="minorHAnsi"/>
+          <w:lang w:val="en-AT"/>
+        </w:rPr>
+        <w:t xml:space="preserve">, </w:t>
+      </w:r>
+      <w:proofErr w:type="spellStart"/>
+      <w:proofErr w:type="gramStart"/>
+      <w:r>
+        <w:rPr>
+          <w:rFonts w:asciiTheme="minorHAnsi" w:hAnsiTheme="minorHAnsi"/>
+          <w:lang w:val="en-AT"/>
+        </w:rPr>
+        <w:t>paperless.ocr.results</w:t>
+      </w:r>
+      <w:proofErr w:type="spellEnd"/>
+      <w:proofErr w:type="gramEnd"/>
+      <w:r>
+        <w:rPr>
+          <w:rFonts w:asciiTheme="minorHAnsi" w:hAnsiTheme="minorHAnsi"/>
+          <w:lang w:val="en-AT"/>
+        </w:rPr>
+        <w:t>) from environment variables.</w:t>
       </w:r>
     </w:p>
     <w:p>
@@ -195,7 +253,7 @@
         <w:pStyle w:val="Textbody"/>
         <w:numPr>
           <w:ilvl w:val="0"/>
-          <w:numId w:val="3"/>
+          <w:numId w:val="5"/>
         </w:numPr>
         <w:rPr>
           <w:rFonts w:asciiTheme="minorHAnsi" w:hAnsiTheme="minorHAnsi"/>
@@ -207,43 +265,23 @@
           <w:rFonts w:asciiTheme="minorHAnsi" w:hAnsiTheme="minorHAnsi"/>
           <w:lang w:val="en-AT"/>
         </w:rPr>
-        <w:t xml:space="preserve">Connects to RabbitMQ and declares the input queue (e.g. </w:t>
+        <w:t xml:space="preserve">Reads </w:t>
       </w:r>
       <w:proofErr w:type="spellStart"/>
-      <w:proofErr w:type="gramStart"/>
-      <w:r>
-        <w:rPr>
-          <w:rFonts w:asciiTheme="minorHAnsi" w:hAnsiTheme="minorHAnsi"/>
-          <w:lang w:val="en-AT"/>
-        </w:rPr>
-        <w:t>paperless.ocr.input</w:t>
+      <w:r>
+        <w:rPr>
+          <w:rFonts w:asciiTheme="minorHAnsi" w:hAnsiTheme="minorHAnsi"/>
+          <w:lang w:val="en-AT"/>
+        </w:rPr>
+        <w:t>MinIO</w:t>
       </w:r>
       <w:proofErr w:type="spellEnd"/>
-      <w:proofErr w:type="gramEnd"/>
-      <w:r>
-        <w:rPr>
-          <w:rFonts w:asciiTheme="minorHAnsi" w:hAnsiTheme="minorHAnsi"/>
-          <w:lang w:val="en-AT"/>
-        </w:rPr>
-        <w:t xml:space="preserve">) and result queue (e.g. </w:t>
-      </w:r>
-      <w:proofErr w:type="spellStart"/>
-      <w:proofErr w:type="gramStart"/>
-      <w:r>
-        <w:rPr>
-          <w:rFonts w:asciiTheme="minorHAnsi" w:hAnsiTheme="minorHAnsi"/>
-          <w:lang w:val="en-AT"/>
-        </w:rPr>
-        <w:t>paperless.ocr.results</w:t>
-      </w:r>
-      <w:proofErr w:type="spellEnd"/>
-      <w:proofErr w:type="gramEnd"/>
-      <w:r>
-        <w:rPr>
-          <w:rFonts w:asciiTheme="minorHAnsi" w:hAnsiTheme="minorHAnsi"/>
-          <w:lang w:val="en-AT"/>
-        </w:rPr>
-        <w:t>).</w:t>
+      <w:r>
+        <w:rPr>
+          <w:rFonts w:asciiTheme="minorHAnsi" w:hAnsiTheme="minorHAnsi"/>
+          <w:lang w:val="en-AT"/>
+        </w:rPr>
+        <w:t xml:space="preserve"> connection settings (endpoint, access key, secret key, bucket name) from environment variables.</w:t>
       </w:r>
     </w:p>
     <w:p>
@@ -251,7 +289,7 @@
         <w:pStyle w:val="Textbody"/>
         <w:numPr>
           <w:ilvl w:val="0"/>
-          <w:numId w:val="3"/>
+          <w:numId w:val="5"/>
         </w:numPr>
         <w:rPr>
           <w:rFonts w:asciiTheme="minorHAnsi" w:hAnsiTheme="minorHAnsi"/>
@@ -263,21 +301,7 @@
           <w:rFonts w:asciiTheme="minorHAnsi" w:hAnsiTheme="minorHAnsi"/>
           <w:lang w:val="en-AT"/>
         </w:rPr>
-        <w:t>Subscribes to the input queu</w:t>
-      </w:r>
-      <w:r>
-        <w:rPr>
-          <w:rFonts w:asciiTheme="minorHAnsi" w:hAnsiTheme="minorHAnsi"/>
-          <w:lang w:val="en-AT"/>
-        </w:rPr>
-        <w:t>e</w:t>
-      </w:r>
-      <w:r>
-        <w:rPr>
-          <w:rFonts w:asciiTheme="minorHAnsi" w:hAnsiTheme="minorHAnsi"/>
-          <w:lang w:val="en-AT"/>
-        </w:rPr>
-        <w:t>.</w:t>
+        <w:t>Connects to RabbitMQ and declares the input and result queues.</w:t>
       </w:r>
     </w:p>
     <w:p>
@@ -285,7 +309,7 @@
         <w:pStyle w:val="Textbody"/>
         <w:numPr>
           <w:ilvl w:val="0"/>
-          <w:numId w:val="3"/>
+          <w:numId w:val="5"/>
         </w:numPr>
         <w:rPr>
           <w:rFonts w:asciiTheme="minorHAnsi" w:hAnsiTheme="minorHAnsi"/>
@@ -297,7 +321,7 @@
           <w:rFonts w:asciiTheme="minorHAnsi" w:hAnsiTheme="minorHAnsi"/>
           <w:lang w:val="en-AT"/>
         </w:rPr>
-        <w:t xml:space="preserve">Deserializes incoming JSON messages to extract </w:t>
+        <w:t xml:space="preserve">Subscribes to the input queue and receives OCR job messages (containing at least </w:t>
       </w:r>
       <w:proofErr w:type="spellStart"/>
       <w:r>
@@ -313,7 +337,7 @@
           <w:rFonts w:asciiTheme="minorHAnsi" w:hAnsiTheme="minorHAnsi"/>
           <w:lang w:val="en-AT"/>
         </w:rPr>
-        <w:t xml:space="preserve"> and </w:t>
+        <w:t xml:space="preserve"> and the </w:t>
       </w:r>
       <w:proofErr w:type="spellStart"/>
       <w:r>
@@ -321,7 +345,7 @@
           <w:rFonts w:asciiTheme="minorHAnsi" w:hAnsiTheme="minorHAnsi"/>
           <w:lang w:val="en-AT"/>
         </w:rPr>
-        <w:t>DocumentTitle</w:t>
+        <w:t>MinIO</w:t>
       </w:r>
       <w:proofErr w:type="spellEnd"/>
       <w:r>
@@ -329,7 +353,7 @@
           <w:rFonts w:asciiTheme="minorHAnsi" w:hAnsiTheme="minorHAnsi"/>
           <w:lang w:val="en-AT"/>
         </w:rPr>
-        <w:t>.</w:t>
+        <w:t xml:space="preserve"> object key).</w:t>
       </w:r>
     </w:p>
     <w:p>
@@ -337,7 +361,7 @@
         <w:pStyle w:val="Textbody"/>
         <w:numPr>
           <w:ilvl w:val="0"/>
-          <w:numId w:val="3"/>
+          <w:numId w:val="5"/>
         </w:numPr>
         <w:rPr>
           <w:rFonts w:asciiTheme="minorHAnsi" w:hAnsiTheme="minorHAnsi"/>
@@ -349,7 +373,185 @@
           <w:rFonts w:asciiTheme="minorHAnsi" w:hAnsiTheme="minorHAnsi"/>
           <w:lang w:val="en-AT"/>
         </w:rPr>
-        <w:t>Generates a fake OCR summary string for the document.</w:t>
+        <w:t>For each message:</w:t>
+      </w:r>
+    </w:p>
+    <w:p>
+      <w:pPr>
+        <w:pStyle w:val="Textbody"/>
+        <w:numPr>
+          <w:ilvl w:val="1"/>
+          <w:numId w:val="5"/>
+        </w:numPr>
+        <w:rPr>
+          <w:rFonts w:asciiTheme="minorHAnsi" w:hAnsiTheme="minorHAnsi"/>
+          <w:lang w:val="en-AT"/>
+        </w:rPr>
+      </w:pPr>
+      <w:r>
+        <w:rPr>
+          <w:rFonts w:asciiTheme="minorHAnsi" w:hAnsiTheme="minorHAnsi"/>
+          <w:lang w:val="en-AT"/>
+        </w:rPr>
+        <w:t xml:space="preserve">Downloads the original PDF document from </w:t>
+      </w:r>
+      <w:proofErr w:type="spellStart"/>
+      <w:r>
+        <w:rPr>
+          <w:rFonts w:asciiTheme="minorHAnsi" w:hAnsiTheme="minorHAnsi"/>
+          <w:lang w:val="en-AT"/>
+        </w:rPr>
+        <w:t>MinIO</w:t>
+      </w:r>
+      <w:proofErr w:type="spellEnd"/>
+      <w:r>
+        <w:rPr>
+          <w:rFonts w:asciiTheme="minorHAnsi" w:hAnsiTheme="minorHAnsi"/>
+          <w:lang w:val="en-AT"/>
+        </w:rPr>
+        <w:t xml:space="preserve"> via the S3 API.</w:t>
+      </w:r>
+    </w:p>
+    <w:p>
+      <w:pPr>
+        <w:pStyle w:val="Textbody"/>
+        <w:numPr>
+          <w:ilvl w:val="1"/>
+          <w:numId w:val="5"/>
+        </w:numPr>
+        <w:rPr>
+          <w:rFonts w:asciiTheme="minorHAnsi" w:hAnsiTheme="minorHAnsi"/>
+          <w:lang w:val="en-AT"/>
+        </w:rPr>
+      </w:pPr>
+      <w:r>
+        <w:rPr>
+          <w:rFonts w:asciiTheme="minorHAnsi" w:hAnsiTheme="minorHAnsi"/>
+          <w:lang w:val="en-AT"/>
+        </w:rPr>
+        <w:t>Invokes the OCR engine (e.g. Tesseract/</w:t>
+      </w:r>
+      <w:proofErr w:type="spellStart"/>
+      <w:r>
+        <w:rPr>
+          <w:rFonts w:asciiTheme="minorHAnsi" w:hAnsiTheme="minorHAnsi"/>
+          <w:lang w:val="en-AT"/>
+        </w:rPr>
+        <w:t>Ghostscript</w:t>
+      </w:r>
+      <w:proofErr w:type="spellEnd"/>
+      <w:r>
+        <w:rPr>
+          <w:rFonts w:asciiTheme="minorHAnsi" w:hAnsiTheme="minorHAnsi"/>
+          <w:lang w:val="en-AT"/>
+        </w:rPr>
+        <w:t xml:space="preserve"> wrapper) to extract text from the PDF.</w:t>
+      </w:r>
+    </w:p>
+    <w:p>
+      <w:pPr>
+        <w:pStyle w:val="Textbody"/>
+        <w:numPr>
+          <w:ilvl w:val="1"/>
+          <w:numId w:val="5"/>
+        </w:numPr>
+        <w:rPr>
+          <w:rFonts w:asciiTheme="minorHAnsi" w:hAnsiTheme="minorHAnsi"/>
+          <w:lang w:val="en-AT"/>
+        </w:rPr>
+      </w:pPr>
+      <w:r>
+        <w:rPr>
+          <w:rFonts w:asciiTheme="minorHAnsi" w:hAnsiTheme="minorHAnsi"/>
+          <w:lang w:val="en-AT"/>
+        </w:rPr>
+        <w:t>Builds an OCR result payload (</w:t>
+      </w:r>
+      <w:proofErr w:type="spellStart"/>
+      <w:r>
+        <w:rPr>
+          <w:rFonts w:asciiTheme="minorHAnsi" w:hAnsiTheme="minorHAnsi"/>
+          <w:lang w:val="en-AT"/>
+        </w:rPr>
+        <w:t>ResultModel</w:t>
+      </w:r>
+      <w:proofErr w:type="spellEnd"/>
+      <w:r>
+        <w:rPr>
+          <w:rFonts w:asciiTheme="minorHAnsi" w:hAnsiTheme="minorHAnsi"/>
+          <w:lang w:val="en-AT"/>
+        </w:rPr>
+        <w:t xml:space="preserve">) containing </w:t>
+      </w:r>
+      <w:proofErr w:type="spellStart"/>
+      <w:r>
+        <w:rPr>
+          <w:rFonts w:asciiTheme="minorHAnsi" w:hAnsiTheme="minorHAnsi"/>
+          <w:lang w:val="en-AT"/>
+        </w:rPr>
+        <w:t>DocumentId</w:t>
+      </w:r>
+      <w:proofErr w:type="spellEnd"/>
+      <w:r>
+        <w:rPr>
+          <w:rFonts w:asciiTheme="minorHAnsi" w:hAnsiTheme="minorHAnsi"/>
+          <w:lang w:val="en-AT"/>
+        </w:rPr>
+        <w:t xml:space="preserve">, extracted Summary, and </w:t>
+      </w:r>
+      <w:proofErr w:type="spellStart"/>
+      <w:r>
+        <w:rPr>
+          <w:rFonts w:asciiTheme="minorHAnsi" w:hAnsiTheme="minorHAnsi"/>
+          <w:lang w:val="en-AT"/>
+        </w:rPr>
+        <w:t>ProcessedAt</w:t>
+      </w:r>
+      <w:proofErr w:type="spellEnd"/>
+      <w:r>
+        <w:rPr>
+          <w:rFonts w:asciiTheme="minorHAnsi" w:hAnsiTheme="minorHAnsi"/>
+          <w:lang w:val="en-AT"/>
+        </w:rPr>
+        <w:t xml:space="preserve"> timestamp.</w:t>
+      </w:r>
+    </w:p>
+    <w:p>
+      <w:pPr>
+        <w:pStyle w:val="Textbody"/>
+        <w:numPr>
+          <w:ilvl w:val="1"/>
+          <w:numId w:val="5"/>
+        </w:numPr>
+        <w:rPr>
+          <w:rFonts w:asciiTheme="minorHAnsi" w:hAnsiTheme="minorHAnsi"/>
+          <w:lang w:val="en-AT"/>
+        </w:rPr>
+      </w:pPr>
+      <w:r>
+        <w:rPr>
+          <w:rFonts w:asciiTheme="minorHAnsi" w:hAnsiTheme="minorHAnsi"/>
+          <w:lang w:val="en-AT"/>
+        </w:rPr>
+        <w:t>Publishes the result as a JSON message to the result queue (</w:t>
+      </w:r>
+      <w:proofErr w:type="spellStart"/>
+      <w:proofErr w:type="gramStart"/>
+      <w:r>
+        <w:rPr>
+          <w:rFonts w:asciiTheme="minorHAnsi" w:hAnsiTheme="minorHAnsi"/>
+          <w:lang w:val="en-AT"/>
+        </w:rPr>
+        <w:t>paperless.ocr.results</w:t>
+      </w:r>
+      <w:proofErr w:type="spellEnd"/>
+      <w:proofErr w:type="gramEnd"/>
+      <w:r>
+        <w:rPr>
+          <w:rFonts w:asciiTheme="minorHAnsi" w:hAnsiTheme="minorHAnsi"/>
+          <w:lang w:val="en-AT"/>
+        </w:rPr>
+        <w:t>).</w:t>
       </w:r>
     </w:p>
     <w:p>
@@ -357,7 +559,7 @@
         <w:pStyle w:val="Textbody"/>
         <w:numPr>
           <w:ilvl w:val="0"/>
-          <w:numId w:val="3"/>
+          <w:numId w:val="5"/>
         </w:numPr>
         <w:rPr>
           <w:rFonts w:asciiTheme="minorHAnsi" w:hAnsiTheme="minorHAnsi"/>
@@ -369,27 +571,88 @@
           <w:rFonts w:asciiTheme="minorHAnsi" w:hAnsiTheme="minorHAnsi"/>
           <w:lang w:val="en-AT"/>
         </w:rPr>
-        <w:t>Publishes the result as a JSON message to the result queue.</w:t>
+        <w:lastRenderedPageBreak/>
+        <w:t xml:space="preserve">Uses log4net for logging and ACK/NACK semantics for reliable message processing. Errors during OCR or </w:t>
+      </w:r>
+      <w:proofErr w:type="spellStart"/>
+      <w:r>
+        <w:rPr>
+          <w:rFonts w:asciiTheme="minorHAnsi" w:hAnsiTheme="minorHAnsi"/>
+          <w:lang w:val="en-AT"/>
+        </w:rPr>
+        <w:t>MinIO</w:t>
+      </w:r>
+      <w:proofErr w:type="spellEnd"/>
+      <w:r>
+        <w:rPr>
+          <w:rFonts w:asciiTheme="minorHAnsi" w:hAnsiTheme="minorHAnsi"/>
+          <w:lang w:val="en-AT"/>
+        </w:rPr>
+        <w:t xml:space="preserve"> access cause a NACK with requeue, so messages are retried.</w:t>
       </w:r>
     </w:p>
     <w:p>
       <w:pPr>
         <w:pStyle w:val="Textbody"/>
-        <w:numPr>
-          <w:ilvl w:val="0"/>
-          <w:numId w:val="3"/>
-        </w:numPr>
-        <w:rPr>
-          <w:rFonts w:asciiTheme="minorHAnsi" w:hAnsiTheme="minorHAnsi"/>
-          <w:lang w:val="en-AT"/>
-        </w:rPr>
-      </w:pPr>
-      <w:r>
-        <w:rPr>
-          <w:rFonts w:asciiTheme="minorHAnsi" w:hAnsiTheme="minorHAnsi"/>
-          <w:lang w:val="en-AT"/>
-        </w:rPr>
-        <w:t>Uses log4net for logging and ACK/NACK semantics for reliable processing.</w:t>
+        <w:rPr>
+          <w:rFonts w:asciiTheme="minorHAnsi" w:hAnsiTheme="minorHAnsi"/>
+          <w:lang w:val="en-AT"/>
+        </w:rPr>
+      </w:pPr>
+      <w:r>
+        <w:rPr>
+          <w:rFonts w:asciiTheme="minorHAnsi" w:hAnsiTheme="minorHAnsi"/>
+          <w:lang w:val="en-AT"/>
+        </w:rPr>
+        <w:t xml:space="preserve">All message handling, </w:t>
+      </w:r>
+      <w:proofErr w:type="spellStart"/>
+      <w:r>
+        <w:rPr>
+          <w:rFonts w:asciiTheme="minorHAnsi" w:hAnsiTheme="minorHAnsi"/>
+          <w:lang w:val="en-AT"/>
+        </w:rPr>
+        <w:t>MinIO</w:t>
+      </w:r>
+      <w:proofErr w:type="spellEnd"/>
+      <w:r>
+        <w:rPr>
+          <w:rFonts w:asciiTheme="minorHAnsi" w:hAnsiTheme="minorHAnsi"/>
+          <w:lang w:val="en-AT"/>
+        </w:rPr>
+        <w:t xml:space="preserve"> access and OCR invocation are currently implemented inside </w:t>
+      </w:r>
+      <w:proofErr w:type="spellStart"/>
+      <w:r>
+        <w:rPr>
+          <w:rFonts w:asciiTheme="minorHAnsi" w:hAnsiTheme="minorHAnsi"/>
+          <w:lang w:val="en-AT"/>
+        </w:rPr>
+        <w:t>OcrWorkerService</w:t>
+      </w:r>
+      <w:proofErr w:type="spellEnd"/>
+      <w:r>
+        <w:rPr>
+          <w:rFonts w:asciiTheme="minorHAnsi" w:hAnsiTheme="minorHAnsi"/>
+          <w:lang w:val="en-AT"/>
+        </w:rPr>
+        <w:t xml:space="preserve">. A separate business class (e.g. </w:t>
+      </w:r>
+      <w:proofErr w:type="spellStart"/>
+      <w:r>
+        <w:rPr>
+          <w:rFonts w:asciiTheme="minorHAnsi" w:hAnsiTheme="minorHAnsi"/>
+          <w:lang w:val="en-AT"/>
+        </w:rPr>
+        <w:t>OcrProcessingService</w:t>
+      </w:r>
+      <w:proofErr w:type="spellEnd"/>
+      <w:r>
+        <w:rPr>
+          <w:rFonts w:asciiTheme="minorHAnsi" w:hAnsiTheme="minorHAnsi"/>
+          <w:lang w:val="en-AT"/>
+        </w:rPr>
+        <w:t>) remains a possible future refactoring but is not required for Sprint 4.</w:t>
       </w:r>
     </w:p>
     <w:p>
@@ -398,316 +661,6 @@
         <w:rPr>
           <w:rFonts w:asciiTheme="minorHAnsi" w:hAnsiTheme="minorHAnsi"/>
           <w:lang w:val="en-AT"/>
-        </w:rPr>
-      </w:pPr>
-      <w:r>
-        <w:rPr>
-          <w:rFonts w:asciiTheme="minorHAnsi" w:hAnsiTheme="minorHAnsi"/>
-          <w:lang w:val="en-AT"/>
-        </w:rPr>
-        <w:t xml:space="preserve">At this stage, all logic (message handling and “OCR simulation”) is implemented inside </w:t>
-      </w:r>
-      <w:proofErr w:type="spellStart"/>
-      <w:r>
-        <w:rPr>
-          <w:rFonts w:asciiTheme="minorHAnsi" w:hAnsiTheme="minorHAnsi"/>
-          <w:lang w:val="en-AT"/>
-        </w:rPr>
-        <w:t>OcrWorkerService</w:t>
-      </w:r>
-      <w:proofErr w:type="spellEnd"/>
-      <w:r>
-        <w:rPr>
-          <w:rFonts w:asciiTheme="minorHAnsi" w:hAnsiTheme="minorHAnsi"/>
-          <w:lang w:val="en-AT"/>
-        </w:rPr>
-        <w:t>; there is no separate business service class yet.</w:t>
-      </w:r>
-    </w:p>
-    <w:p>
-      <w:pPr>
-        <w:pStyle w:val="Textbody"/>
-        <w:rPr>
-          <w:rFonts w:asciiTheme="minorHAnsi" w:hAnsiTheme="minorHAnsi"/>
-          <w:lang w:val="en-AT"/>
-        </w:rPr>
-      </w:pPr>
-      <w:r>
-        <w:rPr>
-          <w:rFonts w:asciiTheme="minorHAnsi" w:hAnsiTheme="minorHAnsi"/>
-          <w:b/>
-          <w:bCs/>
-          <w:lang w:val="en-AT"/>
-        </w:rPr>
-        <w:t>OCR Worker – planned business layer (future sprints)</w:t>
-      </w:r>
-    </w:p>
-    <w:p>
-      <w:pPr>
-        <w:pStyle w:val="Textbody"/>
-        <w:rPr>
-          <w:rFonts w:asciiTheme="minorHAnsi" w:hAnsiTheme="minorHAnsi"/>
-          <w:lang w:val="en-AT"/>
-        </w:rPr>
-      </w:pPr>
-      <w:r>
-        <w:rPr>
-          <w:rFonts w:asciiTheme="minorHAnsi" w:hAnsiTheme="minorHAnsi"/>
-          <w:lang w:val="en-AT"/>
-        </w:rPr>
-        <w:t>Business Layer (planned, not yet implemented)</w:t>
-      </w:r>
-      <w:r>
-        <w:rPr>
-          <w:rFonts w:asciiTheme="minorHAnsi" w:hAnsiTheme="minorHAnsi"/>
-          <w:lang w:val="en-AT"/>
-        </w:rPr>
-        <w:br/>
-        <w:t>In later sprints, the OCR Worker will be refactored to separate infrastructure from OCR domain logic:</w:t>
-      </w:r>
-    </w:p>
-    <w:p>
-      <w:pPr>
-        <w:pStyle w:val="Textbody"/>
-        <w:numPr>
-          <w:ilvl w:val="0"/>
-          <w:numId w:val="4"/>
-        </w:numPr>
-        <w:rPr>
-          <w:rFonts w:asciiTheme="minorHAnsi" w:hAnsiTheme="minorHAnsi"/>
-          <w:lang w:val="en-AT"/>
-        </w:rPr>
-      </w:pPr>
-      <w:r>
-        <w:rPr>
-          <w:rFonts w:asciiTheme="minorHAnsi" w:hAnsiTheme="minorHAnsi"/>
-          <w:lang w:val="en-AT"/>
-        </w:rPr>
-        <w:t xml:space="preserve">A dedicated </w:t>
-      </w:r>
-      <w:proofErr w:type="spellStart"/>
-      <w:r>
-        <w:rPr>
-          <w:rFonts w:asciiTheme="minorHAnsi" w:hAnsiTheme="minorHAnsi"/>
-          <w:lang w:val="en-AT"/>
-        </w:rPr>
-        <w:t>OcrProcessingService</w:t>
-      </w:r>
-      <w:proofErr w:type="spellEnd"/>
-      <w:r>
-        <w:rPr>
-          <w:rFonts w:asciiTheme="minorHAnsi" w:hAnsiTheme="minorHAnsi"/>
-          <w:lang w:val="en-AT"/>
-        </w:rPr>
-        <w:t xml:space="preserve"> will encapsulate:</w:t>
-      </w:r>
-    </w:p>
-    <w:p>
-      <w:pPr>
-        <w:pStyle w:val="Textbody"/>
-        <w:numPr>
-          <w:ilvl w:val="1"/>
-          <w:numId w:val="4"/>
-        </w:numPr>
-        <w:rPr>
-          <w:rFonts w:asciiTheme="minorHAnsi" w:hAnsiTheme="minorHAnsi"/>
-          <w:lang w:val="en-AT"/>
-        </w:rPr>
-      </w:pPr>
-      <w:r>
-        <w:rPr>
-          <w:rFonts w:asciiTheme="minorHAnsi" w:hAnsiTheme="minorHAnsi"/>
-          <w:lang w:val="en-AT"/>
-        </w:rPr>
-        <w:t xml:space="preserve">Retrieving the original document from </w:t>
-      </w:r>
-      <w:proofErr w:type="spellStart"/>
-      <w:r>
-        <w:rPr>
-          <w:rFonts w:asciiTheme="minorHAnsi" w:hAnsiTheme="minorHAnsi"/>
-          <w:lang w:val="en-AT"/>
-        </w:rPr>
-        <w:t>MinIO</w:t>
-      </w:r>
-      <w:proofErr w:type="spellEnd"/>
-      <w:r>
-        <w:rPr>
-          <w:rFonts w:asciiTheme="minorHAnsi" w:hAnsiTheme="minorHAnsi"/>
-          <w:lang w:val="en-AT"/>
-        </w:rPr>
-        <w:t xml:space="preserve"> (via an </w:t>
-      </w:r>
-      <w:proofErr w:type="spellStart"/>
-      <w:r>
-        <w:rPr>
-          <w:rFonts w:asciiTheme="minorHAnsi" w:hAnsiTheme="minorHAnsi"/>
-          <w:lang w:val="en-AT"/>
-        </w:rPr>
-        <w:t>IFileStoreClient</w:t>
-      </w:r>
-      <w:proofErr w:type="spellEnd"/>
-      <w:r>
-        <w:rPr>
-          <w:rFonts w:asciiTheme="minorHAnsi" w:hAnsiTheme="minorHAnsi"/>
-          <w:lang w:val="en-AT"/>
-        </w:rPr>
-        <w:t>).</w:t>
-      </w:r>
-    </w:p>
-    <w:p>
-      <w:pPr>
-        <w:pStyle w:val="Textbody"/>
-        <w:numPr>
-          <w:ilvl w:val="1"/>
-          <w:numId w:val="4"/>
-        </w:numPr>
-        <w:rPr>
-          <w:rFonts w:asciiTheme="minorHAnsi" w:hAnsiTheme="minorHAnsi"/>
-          <w:lang w:val="en-AT"/>
-        </w:rPr>
-      </w:pPr>
-      <w:r>
-        <w:rPr>
-          <w:rFonts w:asciiTheme="minorHAnsi" w:hAnsiTheme="minorHAnsi"/>
-          <w:lang w:val="en-AT"/>
-        </w:rPr>
-        <w:t>Invoking a real OCR engine</w:t>
-      </w:r>
-      <w:r>
-        <w:rPr>
-          <w:rFonts w:asciiTheme="minorHAnsi" w:hAnsiTheme="minorHAnsi"/>
-          <w:lang w:val="en-AT"/>
-        </w:rPr>
-        <w:t xml:space="preserve"> </w:t>
-      </w:r>
-      <w:r>
-        <w:rPr>
-          <w:rFonts w:asciiTheme="minorHAnsi" w:hAnsiTheme="minorHAnsi"/>
-          <w:lang w:val="en-AT"/>
-        </w:rPr>
-        <w:t>to extract text.</w:t>
-      </w:r>
-    </w:p>
-    <w:p>
-      <w:pPr>
-        <w:pStyle w:val="Textbody"/>
-        <w:numPr>
-          <w:ilvl w:val="1"/>
-          <w:numId w:val="4"/>
-        </w:numPr>
-        <w:rPr>
-          <w:rFonts w:asciiTheme="minorHAnsi" w:hAnsiTheme="minorHAnsi"/>
-          <w:lang w:val="en-AT"/>
-        </w:rPr>
-      </w:pPr>
-      <w:r>
-        <w:rPr>
-          <w:rFonts w:asciiTheme="minorHAnsi" w:hAnsiTheme="minorHAnsi"/>
-          <w:lang w:val="en-AT"/>
-        </w:rPr>
-        <w:lastRenderedPageBreak/>
-        <w:t>Building a domain model for OCR results (</w:t>
-      </w:r>
-      <w:proofErr w:type="spellStart"/>
-      <w:r>
-        <w:rPr>
-          <w:rFonts w:asciiTheme="minorHAnsi" w:hAnsiTheme="minorHAnsi"/>
-          <w:lang w:val="en-AT"/>
-        </w:rPr>
-        <w:t>OcrResult</w:t>
-      </w:r>
-      <w:proofErr w:type="spellEnd"/>
-      <w:r>
-        <w:rPr>
-          <w:rFonts w:asciiTheme="minorHAnsi" w:hAnsiTheme="minorHAnsi"/>
-          <w:lang w:val="en-AT"/>
-        </w:rPr>
-        <w:t xml:space="preserve">, </w:t>
-      </w:r>
-      <w:proofErr w:type="spellStart"/>
-      <w:r>
-        <w:rPr>
-          <w:rFonts w:asciiTheme="minorHAnsi" w:hAnsiTheme="minorHAnsi"/>
-          <w:lang w:val="en-AT"/>
-        </w:rPr>
-        <w:t>ResultModel</w:t>
-      </w:r>
-      <w:proofErr w:type="spellEnd"/>
-      <w:r>
-        <w:rPr>
-          <w:rFonts w:asciiTheme="minorHAnsi" w:hAnsiTheme="minorHAnsi"/>
-          <w:lang w:val="en-AT"/>
-        </w:rPr>
-        <w:t>).</w:t>
-      </w:r>
-    </w:p>
-    <w:p>
-      <w:pPr>
-        <w:pStyle w:val="Textbody"/>
-        <w:numPr>
-          <w:ilvl w:val="1"/>
-          <w:numId w:val="4"/>
-        </w:numPr>
-        <w:rPr>
-          <w:rFonts w:asciiTheme="minorHAnsi" w:hAnsiTheme="minorHAnsi"/>
-          <w:lang w:val="en-AT"/>
-        </w:rPr>
-      </w:pPr>
-      <w:r>
-        <w:rPr>
-          <w:rFonts w:asciiTheme="minorHAnsi" w:hAnsiTheme="minorHAnsi"/>
-          <w:lang w:val="en-AT"/>
-        </w:rPr>
-        <w:t>Publishing the result to RabbitMQ or calling the Paperless REST API for persistence.</w:t>
-      </w:r>
-    </w:p>
-    <w:p>
-      <w:pPr>
-        <w:pStyle w:val="Textbody"/>
-        <w:rPr>
-          <w:rFonts w:asciiTheme="minorHAnsi" w:hAnsiTheme="minorHAnsi"/>
-          <w:lang w:val="en-AT"/>
-        </w:rPr>
-      </w:pPr>
-      <w:proofErr w:type="spellStart"/>
-      <w:r>
-        <w:rPr>
-          <w:rFonts w:asciiTheme="minorHAnsi" w:hAnsiTheme="minorHAnsi"/>
-          <w:lang w:val="en-AT"/>
-        </w:rPr>
-        <w:t>OcrWorkerService</w:t>
-      </w:r>
-      <w:proofErr w:type="spellEnd"/>
-      <w:r>
-        <w:rPr>
-          <w:rFonts w:asciiTheme="minorHAnsi" w:hAnsiTheme="minorHAnsi"/>
-          <w:lang w:val="en-AT"/>
-        </w:rPr>
-        <w:t xml:space="preserve"> will then focus solely on message consumption and delegation, while </w:t>
-      </w:r>
-      <w:proofErr w:type="spellStart"/>
-      <w:r>
-        <w:rPr>
-          <w:rFonts w:asciiTheme="minorHAnsi" w:hAnsiTheme="minorHAnsi"/>
-          <w:lang w:val="en-AT"/>
-        </w:rPr>
-        <w:t>OcrProcessingService</w:t>
-      </w:r>
-      <w:proofErr w:type="spellEnd"/>
-      <w:r>
-        <w:rPr>
-          <w:rFonts w:asciiTheme="minorHAnsi" w:hAnsiTheme="minorHAnsi"/>
-          <w:lang w:val="en-AT"/>
-        </w:rPr>
-        <w:t xml:space="preserve"> will implement the actual OCR workflow.</w:t>
-      </w:r>
-    </w:p>
-    <w:p>
-      <w:pPr>
-        <w:pStyle w:val="Textbody"/>
-        <w:rPr>
-          <w:rFonts w:asciiTheme="minorHAnsi" w:hAnsiTheme="minorHAnsi"/>
-          <w:lang w:val="en-US"/>
         </w:rPr>
       </w:pPr>
     </w:p>
@@ -1062,6 +1015,155 @@
     </w:lvl>
   </w:abstractNum>
   <w:abstractNum w:abstractNumId="2" w15:restartNumberingAfterBreak="0">
+    <w:nsid w:val="4FB51796"/>
+    <w:multiLevelType w:val="multilevel"/>
+    <w:tmpl w:val="0B88D2E2"/>
+    <w:lvl w:ilvl="0">
+      <w:start w:val="1"/>
+      <w:numFmt w:val="bullet"/>
+      <w:lvlText w:val=""/>
+      <w:lvlJc w:val="left"/>
+      <w:pPr>
+        <w:tabs>
+          <w:tab w:val="num" w:pos="720"/>
+        </w:tabs>
+        <w:ind w:left="720" w:hanging="360"/>
+      </w:pPr>
+      <w:rPr>
+        <w:rFonts w:ascii="Symbol" w:hAnsi="Symbol" w:hint="default"/>
+        <w:sz w:val="20"/>
+      </w:rPr>
+    </w:lvl>
+    <w:lvl w:ilvl="1">
+      <w:start w:val="1"/>
+      <w:numFmt w:val="bullet"/>
+      <w:lvlText w:val="o"/>
+      <w:lvlJc w:val="left"/>
+      <w:pPr>
+        <w:tabs>
+          <w:tab w:val="num" w:pos="1440"/>
+        </w:tabs>
+        <w:ind w:left="1440" w:hanging="360"/>
+      </w:pPr>
+      <w:rPr>
+        <w:rFonts w:ascii="Courier New" w:hAnsi="Courier New" w:hint="default"/>
+        <w:sz w:val="20"/>
+      </w:rPr>
+    </w:lvl>
+    <w:lvl w:ilvl="2" w:tentative="1">
+      <w:start w:val="1"/>
+      <w:numFmt w:val="bullet"/>
+      <w:lvlText w:val=""/>
+      <w:lvlJc w:val="left"/>
+      <w:pPr>
+        <w:tabs>
+          <w:tab w:val="num" w:pos="2160"/>
+        </w:tabs>
+        <w:ind w:left="2160" w:hanging="360"/>
+      </w:pPr>
+      <w:rPr>
+        <w:rFonts w:ascii="Wingdings" w:hAnsi="Wingdings" w:hint="default"/>
+        <w:sz w:val="20"/>
+      </w:rPr>
+    </w:lvl>
+    <w:lvl w:ilvl="3" w:tentative="1">
+      <w:start w:val="1"/>
+      <w:numFmt w:val="bullet"/>
+      <w:lvlText w:val=""/>
+      <w:lvlJc w:val="left"/>
+      <w:pPr>
+        <w:tabs>
+          <w:tab w:val="num" w:pos="2880"/>
+        </w:tabs>
+        <w:ind w:left="2880" w:hanging="360"/>
+      </w:pPr>
+      <w:rPr>
+        <w:rFonts w:ascii="Wingdings" w:hAnsi="Wingdings" w:hint="default"/>
+        <w:sz w:val="20"/>
+      </w:rPr>
+    </w:lvl>
+    <w:lvl w:ilvl="4" w:tentative="1">
+      <w:start w:val="1"/>
+      <w:numFmt w:val="bullet"/>
+      <w:lvlText w:val=""/>
+      <w:lvlJc w:val="left"/>
+      <w:pPr>
+        <w:tabs>
+          <w:tab w:val="num" w:pos="3600"/>
+        </w:tabs>
+        <w:ind w:left="3600" w:hanging="360"/>
+      </w:pPr>
+      <w:rPr>
+        <w:rFonts w:ascii="Wingdings" w:hAnsi="Wingdings" w:hint="default"/>
+        <w:sz w:val="20"/>
+      </w:rPr>
+    </w:lvl>
+    <w:lvl w:ilvl="5" w:tentative="1">
+      <w:start w:val="1"/>
+      <w:numFmt w:val="bullet"/>
+      <w:lvlText w:val=""/>
+      <w:lvlJc w:val="left"/>
+      <w:pPr>
+        <w:tabs>
+          <w:tab w:val="num" w:pos="4320"/>
+        </w:tabs>
+        <w:ind w:left="4320" w:hanging="360"/>
+      </w:pPr>
+      <w:rPr>
+        <w:rFonts w:ascii="Wingdings" w:hAnsi="Wingdings" w:hint="default"/>
+        <w:sz w:val="20"/>
+      </w:rPr>
+    </w:lvl>
+    <w:lvl w:ilvl="6" w:tentative="1">
+      <w:start w:val="1"/>
+      <w:numFmt w:val="bullet"/>
+      <w:lvlText w:val=""/>
+      <w:lvlJc w:val="left"/>
+      <w:pPr>
+        <w:tabs>
+          <w:tab w:val="num" w:pos="5040"/>
+        </w:tabs>
+        <w:ind w:left="5040" w:hanging="360"/>
+      </w:pPr>
+      <w:rPr>
+        <w:rFonts w:ascii="Wingdings" w:hAnsi="Wingdings" w:hint="default"/>
+        <w:sz w:val="20"/>
+      </w:rPr>
+    </w:lvl>
+    <w:lvl w:ilvl="7" w:tentative="1">
+      <w:start w:val="1"/>
+      <w:numFmt w:val="bullet"/>
+      <w:lvlText w:val=""/>
+      <w:lvlJc w:val="left"/>
+      <w:pPr>
+        <w:tabs>
+          <w:tab w:val="num" w:pos="5760"/>
+        </w:tabs>
+        <w:ind w:left="5760" w:hanging="360"/>
+      </w:pPr>
+      <w:rPr>
+        <w:rFonts w:ascii="Wingdings" w:hAnsi="Wingdings" w:hint="default"/>
+        <w:sz w:val="20"/>
+      </w:rPr>
+    </w:lvl>
+    <w:lvl w:ilvl="8" w:tentative="1">
+      <w:start w:val="1"/>
+      <w:numFmt w:val="bullet"/>
+      <w:lvlText w:val=""/>
+      <w:lvlJc w:val="left"/>
+      <w:pPr>
+        <w:tabs>
+          <w:tab w:val="num" w:pos="6480"/>
+        </w:tabs>
+        <w:ind w:left="6480" w:hanging="360"/>
+      </w:pPr>
+      <w:rPr>
+        <w:rFonts w:ascii="Wingdings" w:hAnsi="Wingdings" w:hint="default"/>
+        <w:sz w:val="20"/>
+      </w:rPr>
+    </w:lvl>
+  </w:abstractNum>
+  <w:abstractNum w:abstractNumId="3" w15:restartNumberingAfterBreak="0">
     <w:nsid w:val="67602C11"/>
     <w:multiLevelType w:val="multilevel"/>
     <w:tmpl w:val="91AC0A7E"/>
@@ -1165,7 +1267,7 @@
       </w:rPr>
     </w:lvl>
   </w:abstractNum>
-  <w:abstractNum w:abstractNumId="3" w15:restartNumberingAfterBreak="0">
+  <w:abstractNum w:abstractNumId="4" w15:restartNumberingAfterBreak="0">
     <w:nsid w:val="6994215F"/>
     <w:multiLevelType w:val="multilevel"/>
     <w:tmpl w:val="FFB0D0E0"/>
@@ -1270,16 +1372,19 @@
     </w:lvl>
   </w:abstractNum>
   <w:num w:numId="1" w16cid:durableId="1888298920">
-    <w:abstractNumId w:val="3"/>
+    <w:abstractNumId w:val="4"/>
   </w:num>
   <w:num w:numId="2" w16cid:durableId="7024205">
-    <w:abstractNumId w:val="2"/>
+    <w:abstractNumId w:val="3"/>
   </w:num>
   <w:num w:numId="3" w16cid:durableId="1716733679">
     <w:abstractNumId w:val="0"/>
   </w:num>
   <w:num w:numId="4" w16cid:durableId="1109273640">
     <w:abstractNumId w:val="1"/>
+  </w:num>
+  <w:num w:numId="5" w16cid:durableId="1705331387">
+    <w:abstractNumId w:val="2"/>
   </w:num>
 </w:numbering>
 </file>

</xml_diff>